<commit_message>
Clarify trend sequence and unify macro names
Show initial ARDL with trend, assess trend p = 0.1719, then remove trend and reestimate. Use source-column codes consistently for all 22 macro candidates and add their descriptions and units. Coefficients, diagnostics, forecasts and sensitivities are unchanged.
</commit_message>
<xml_diff>
--- a/Noncomp_EF_Full_Experiment_Report_EN_20261019.docx
+++ b/Noncomp_EF_Full_Experiment_Report_EN_20261019.docx
@@ -34,7 +34,7 @@
         <w:rPr>
           <w:color w:val="000000"/>
         </w:rPr>
-        <w:t>We evaluate a level and trend break in EF, screen 22 macroeconomic candidates, and estimate an ARDL forecasting model. The final model uses the postbreak dummy, lagged EF and the lagged quarterly change in unemployment. It contains neither a linear trend nor a transition pulse.</w:t>
+        <w:t>We first examine the level and trend break in EF. We then screen 22 macro candidates in an ARDL that includes a linear trend. The trend coefficient is not significant (p = 0.1719), so we remove it and reestimate the model. Neither ARDL specification includes a transition pulse.</w:t>
       </w:r>
     </w:p>
     <w:p>
@@ -45,7 +45,7 @@
         <w:rPr>
           <w:color w:val="000000"/>
         </w:rPr>
-        <w:t>The unrate, gap and GDP models have very similar in-sample fit. Unrate has the lowest one-step validation RMSE and a direct economic interpretation. GDP has the lowest recursive RMSE. We select unrate using this combined assessment, rather than presenting it as the winner of every statistical ranking.</w:t>
+        <w:t>The FLBR_B.IUSA (unemployment), FGAP_B.IUSA (output gap) and FGDP$_B.IUSA (real GDP) models have very similar in-sample fit. FLBR_B.IUSA has the lowest one-step validation RMSE and a direct economic interpretation. FGDP$_B.IUSA has the lowest recursive RMSE. We select FLBR_B.IUSA using this combined assessment, not as the winner of every statistical ranking.</w:t>
       </w:r>
     </w:p>
     <w:p>
@@ -748,7 +748,7 @@
         <w:rPr>
           <w:color w:val="000000"/>
         </w:rPr>
-        <w:t>Six macro variables use quarterly log changes: earnings, ulc, eci, gdp, assets and loans. The other 16 use quarterly level differences. Every transformed macro is lagged one quarter. Differences first exist in 2011Q2, so their lagged values first exist in 2011Q3. All candidates therefore use the same 49 development observations.</w:t>
+        <w:t>Six macro variables use quarterly log changes: FAHEFI_B.IUSA, FPCNBULC_B.IUSA, FECICPQ_B.IUSA, FGDP$_B.IUSA, FBBACBQ_B.IUSA and FBBABLLCBQ_B.IUSA. The other 16 use quarterly level differences. All transformed inputs are lagged one quarter, giving the same 49 development observations from 2011Q3. Appendix B provides the source codes, descriptions and units.</w:t>
       </w:r>
     </w:p>
     <w:p>
@@ -3493,7 +3493,7 @@
         <w:rPr>
           <w:color w:val="000000"/>
         </w:rPr>
-        <w:t>4 Macro selection and ARDL with trend</w:t>
+        <w:t>4 Initial ARDL with trend and trend assessment</w:t>
       </w:r>
     </w:p>
     <w:p>
@@ -3504,7 +3504,7 @@
         <w:rPr>
           <w:color w:val="000000"/>
         </w:rPr>
-        <w:t>Strict forward selection starts with a constant, D, t and EF lag 1. In each round, we add the remaining macro with the smallest two-sided conditional p value below 0.05. The search stops when no additional variable qualifies. No backward removal occurs. All 22 candidates use identical observations, transformations and one-quarter macro lags. Appendix A lists every first-round result.</w:t>
+        <w:t>We initially retain a linear trend in the ARDL. Strict forward selection starts with a constant, D, t and EF lag 1. Each round adds the remaining macro with the smallest two-sided conditional p value below 0.05. Selection stops when no additional macro qualifies; no backward removal occurs during the search. All 22 candidates use the same observations, transformations and one-quarter macro lags. Appendix A lists every first-round result.</w:t>
       </w:r>
     </w:p>
     <w:p>
@@ -3657,7 +3657,7 @@
         <w:rPr>
           <w:color w:val="000000"/>
         </w:rPr>
-        <w:t>U denotes the unemployment rate in percent. The data column is named unemp; we refer to it as unrate in the report. ΔU is a percentage-point change. The equation uses smoothed EF in levels and includes no transition pulse.</w:t>
+        <w:t>For compact equations, U denotes FLBR_B.IUSA, the unemployment rate in percent. Thus ΔU is its quarterly percentage-point change. Tables use the source code. The equation uses smoothed EF in levels and includes no transition pulse.</w:t>
       </w:r>
     </w:p>
     <w:p>
@@ -3669,7 +3669,7 @@
         <w:rPr>
           <w:color w:val="000000"/>
         </w:rPr>
-        <w:t>Table 5  Strict forward selection paths</w:t>
+        <w:t>Table 5  Forward selection with trend retained</w:t>
       </w:r>
     </w:p>
     <w:tbl>
@@ -3687,9 +3687,9 @@
         </w:tblBorders>
       </w:tblPr>
       <w:tblGrid>
-        <w:gridCol w:w="2880"/>
-        <w:gridCol w:w="1008"/>
-        <w:gridCol w:w="2304"/>
+        <w:gridCol w:w="2160"/>
+        <w:gridCol w:w="864"/>
+        <w:gridCol w:w="3168"/>
         <w:gridCol w:w="1872"/>
         <w:gridCol w:w="2016"/>
       </w:tblGrid>
@@ -3700,7 +3700,7 @@
         </w:trPr>
         <w:tc>
           <w:tcPr>
-            <w:tcW w:type="dxa" w:w="2880"/>
+            <w:tcW w:type="dxa" w:w="2160"/>
             <w:vAlign w:val="center"/>
             <w:shd w:fill="1F4E78"/>
             <w:tcMar>
@@ -3728,7 +3728,7 @@
         </w:tc>
         <w:tc>
           <w:tcPr>
-            <w:tcW w:type="dxa" w:w="1008"/>
+            <w:tcW w:type="dxa" w:w="864"/>
             <w:vAlign w:val="center"/>
             <w:shd w:fill="1F4E78"/>
             <w:tcMar>
@@ -3756,7 +3756,7 @@
         </w:tc>
         <w:tc>
           <w:tcPr>
-            <w:tcW w:type="dxa" w:w="2304"/>
+            <w:tcW w:type="dxa" w:w="3168"/>
             <w:vAlign w:val="center"/>
             <w:shd w:fill="1F4E78"/>
             <w:tcMar>
@@ -3845,7 +3845,7 @@
         </w:trPr>
         <w:tc>
           <w:tcPr>
-            <w:tcW w:type="dxa" w:w="2880"/>
+            <w:tcW w:type="dxa" w:w="2160"/>
             <w:vAlign w:val="center"/>
             <w:shd w:fill="FFFFFF"/>
             <w:tcMar>
@@ -3873,7 +3873,7 @@
         </w:tc>
         <w:tc>
           <w:tcPr>
-            <w:tcW w:type="dxa" w:w="1008"/>
+            <w:tcW w:type="dxa" w:w="864"/>
             <w:vAlign w:val="center"/>
             <w:shd w:fill="FFFFFF"/>
             <w:tcMar>
@@ -3901,7 +3901,7 @@
         </w:tc>
         <w:tc>
           <w:tcPr>
-            <w:tcW w:type="dxa" w:w="2304"/>
+            <w:tcW w:type="dxa" w:w="3168"/>
             <w:vAlign w:val="center"/>
             <w:shd w:fill="FFFFFF"/>
             <w:tcMar>
@@ -3923,7 +3923,7 @@
                 <w:color w:val="000000"/>
                 <w:sz w:val="20"/>
               </w:rPr>
-              <w:t>unrate</w:t>
+              <w:t>FLBR_B.IUSA</w:t>
             </w:r>
           </w:p>
         </w:tc>
@@ -3990,7 +3990,7 @@
         </w:trPr>
         <w:tc>
           <w:tcPr>
-            <w:tcW w:type="dxa" w:w="2880"/>
+            <w:tcW w:type="dxa" w:w="2160"/>
             <w:vAlign w:val="center"/>
             <w:shd w:fill="F2F6FA"/>
             <w:tcMar>
@@ -4018,7 +4018,7 @@
         </w:tc>
         <w:tc>
           <w:tcPr>
-            <w:tcW w:type="dxa" w:w="1008"/>
+            <w:tcW w:type="dxa" w:w="864"/>
             <w:vAlign w:val="center"/>
             <w:shd w:fill="F2F6FA"/>
             <w:tcMar>
@@ -4046,7 +4046,7 @@
         </w:tc>
         <w:tc>
           <w:tcPr>
-            <w:tcW w:type="dxa" w:w="2304"/>
+            <w:tcW w:type="dxa" w:w="3168"/>
             <w:vAlign w:val="center"/>
             <w:shd w:fill="F2F6FA"/>
             <w:tcMar>
@@ -4097,296 +4097,6 @@
                 <w:sz w:val="20"/>
               </w:rPr>
               <w:t>0.2229</w:t>
-            </w:r>
-          </w:p>
-        </w:tc>
-        <w:tc>
-          <w:tcPr>
-            <w:tcW w:type="dxa" w:w="2016"/>
-            <w:vAlign w:val="center"/>
-            <w:shd w:fill="F2F6FA"/>
-            <w:tcMar>
-              <w:top w:w="95" w:type="dxa"/>
-              <w:bottom w:w="95" w:type="dxa"/>
-              <w:start w:w="105" w:type="dxa"/>
-              <w:end w:w="105" w:type="dxa"/>
-            </w:tcMar>
-          </w:tcPr>
-          <w:p>
-            <w:pPr>
-              <w:spacing w:after="0" w:line="252" w:lineRule="auto"/>
-              <w:jc w:val="center"/>
-            </w:pPr>
-            <w:r>
-              <w:rPr>
-                <w:rFonts w:ascii="Times New Roman" w:hAnsi="Times New Roman"/>
-                <w:b w:val="0"/>
-                <w:color w:val="000000"/>
-                <w:sz w:val="20"/>
-              </w:rPr>
-              <w:t>Stop</w:t>
-            </w:r>
-          </w:p>
-        </w:tc>
-      </w:tr>
-      <w:tr>
-        <w:trPr>
-          <w:cantSplit/>
-        </w:trPr>
-        <w:tc>
-          <w:tcPr>
-            <w:tcW w:type="dxa" w:w="2880"/>
-            <w:vAlign w:val="center"/>
-            <w:shd w:fill="FFFFFF"/>
-            <w:tcMar>
-              <w:top w:w="95" w:type="dxa"/>
-              <w:bottom w:w="95" w:type="dxa"/>
-              <w:start w:w="105" w:type="dxa"/>
-              <w:end w:w="105" w:type="dxa"/>
-            </w:tcMar>
-          </w:tcPr>
-          <w:p>
-            <w:pPr>
-              <w:spacing w:after="0" w:line="252" w:lineRule="auto"/>
-              <w:jc w:val="left"/>
-            </w:pPr>
-            <w:r>
-              <w:rPr>
-                <w:rFonts w:ascii="Times New Roman" w:hAnsi="Times New Roman"/>
-                <w:b w:val="0"/>
-                <w:color w:val="000000"/>
-                <w:sz w:val="20"/>
-              </w:rPr>
-              <w:t>No trend</w:t>
-            </w:r>
-          </w:p>
-        </w:tc>
-        <w:tc>
-          <w:tcPr>
-            <w:tcW w:type="dxa" w:w="1008"/>
-            <w:vAlign w:val="center"/>
-            <w:shd w:fill="FFFFFF"/>
-            <w:tcMar>
-              <w:top w:w="95" w:type="dxa"/>
-              <w:bottom w:w="95" w:type="dxa"/>
-              <w:start w:w="105" w:type="dxa"/>
-              <w:end w:w="105" w:type="dxa"/>
-            </w:tcMar>
-          </w:tcPr>
-          <w:p>
-            <w:pPr>
-              <w:spacing w:after="0" w:line="252" w:lineRule="auto"/>
-              <w:jc w:val="center"/>
-            </w:pPr>
-            <w:r>
-              <w:rPr>
-                <w:rFonts w:ascii="Times New Roman" w:hAnsi="Times New Roman"/>
-                <w:b w:val="0"/>
-                <w:color w:val="000000"/>
-                <w:sz w:val="20"/>
-              </w:rPr>
-              <w:t>1</w:t>
-            </w:r>
-          </w:p>
-        </w:tc>
-        <w:tc>
-          <w:tcPr>
-            <w:tcW w:type="dxa" w:w="2304"/>
-            <w:vAlign w:val="center"/>
-            <w:shd w:fill="FFFFFF"/>
-            <w:tcMar>
-              <w:top w:w="95" w:type="dxa"/>
-              <w:bottom w:w="95" w:type="dxa"/>
-              <w:start w:w="105" w:type="dxa"/>
-              <w:end w:w="105" w:type="dxa"/>
-            </w:tcMar>
-          </w:tcPr>
-          <w:p>
-            <w:pPr>
-              <w:spacing w:after="0" w:line="252" w:lineRule="auto"/>
-              <w:jc w:val="center"/>
-            </w:pPr>
-            <w:r>
-              <w:rPr>
-                <w:rFonts w:ascii="Times New Roman" w:hAnsi="Times New Roman"/>
-                <w:b w:val="0"/>
-                <w:color w:val="000000"/>
-                <w:sz w:val="20"/>
-              </w:rPr>
-              <w:t>gap</w:t>
-            </w:r>
-          </w:p>
-        </w:tc>
-        <w:tc>
-          <w:tcPr>
-            <w:tcW w:type="dxa" w:w="1872"/>
-            <w:vAlign w:val="center"/>
-            <w:shd w:fill="FFFFFF"/>
-            <w:tcMar>
-              <w:top w:w="95" w:type="dxa"/>
-              <w:bottom w:w="95" w:type="dxa"/>
-              <w:start w:w="105" w:type="dxa"/>
-              <w:end w:w="105" w:type="dxa"/>
-            </w:tcMar>
-          </w:tcPr>
-          <w:p>
-            <w:pPr>
-              <w:spacing w:after="0" w:line="252" w:lineRule="auto"/>
-              <w:jc w:val="center"/>
-            </w:pPr>
-            <w:r>
-              <w:rPr>
-                <w:rFonts w:ascii="Times New Roman" w:hAnsi="Times New Roman"/>
-                <w:b w:val="0"/>
-                <w:color w:val="000000"/>
-                <w:sz w:val="20"/>
-              </w:rPr>
-              <w:t>0.0267</w:t>
-            </w:r>
-          </w:p>
-        </w:tc>
-        <w:tc>
-          <w:tcPr>
-            <w:tcW w:type="dxa" w:w="2016"/>
-            <w:vAlign w:val="center"/>
-            <w:shd w:fill="FFFFFF"/>
-            <w:tcMar>
-              <w:top w:w="95" w:type="dxa"/>
-              <w:bottom w:w="95" w:type="dxa"/>
-              <w:start w:w="105" w:type="dxa"/>
-              <w:end w:w="105" w:type="dxa"/>
-            </w:tcMar>
-          </w:tcPr>
-          <w:p>
-            <w:pPr>
-              <w:spacing w:after="0" w:line="252" w:lineRule="auto"/>
-              <w:jc w:val="center"/>
-            </w:pPr>
-            <w:r>
-              <w:rPr>
-                <w:rFonts w:ascii="Times New Roman" w:hAnsi="Times New Roman"/>
-                <w:b w:val="0"/>
-                <w:color w:val="000000"/>
-                <w:sz w:val="20"/>
-              </w:rPr>
-              <w:t>Enter</w:t>
-            </w:r>
-          </w:p>
-        </w:tc>
-      </w:tr>
-      <w:tr>
-        <w:trPr>
-          <w:cantSplit/>
-        </w:trPr>
-        <w:tc>
-          <w:tcPr>
-            <w:tcW w:type="dxa" w:w="2880"/>
-            <w:vAlign w:val="center"/>
-            <w:shd w:fill="F2F6FA"/>
-            <w:tcMar>
-              <w:top w:w="95" w:type="dxa"/>
-              <w:bottom w:w="95" w:type="dxa"/>
-              <w:start w:w="105" w:type="dxa"/>
-              <w:end w:w="105" w:type="dxa"/>
-            </w:tcMar>
-          </w:tcPr>
-          <w:p>
-            <w:pPr>
-              <w:spacing w:after="0" w:line="252" w:lineRule="auto"/>
-              <w:jc w:val="left"/>
-            </w:pPr>
-            <w:r>
-              <w:rPr>
-                <w:rFonts w:ascii="Times New Roman" w:hAnsi="Times New Roman"/>
-                <w:b w:val="0"/>
-                <w:color w:val="000000"/>
-                <w:sz w:val="20"/>
-              </w:rPr>
-              <w:t>No trend</w:t>
-            </w:r>
-          </w:p>
-        </w:tc>
-        <w:tc>
-          <w:tcPr>
-            <w:tcW w:type="dxa" w:w="1008"/>
-            <w:vAlign w:val="center"/>
-            <w:shd w:fill="F2F6FA"/>
-            <w:tcMar>
-              <w:top w:w="95" w:type="dxa"/>
-              <w:bottom w:w="95" w:type="dxa"/>
-              <w:start w:w="105" w:type="dxa"/>
-              <w:end w:w="105" w:type="dxa"/>
-            </w:tcMar>
-          </w:tcPr>
-          <w:p>
-            <w:pPr>
-              <w:spacing w:after="0" w:line="252" w:lineRule="auto"/>
-              <w:jc w:val="center"/>
-            </w:pPr>
-            <w:r>
-              <w:rPr>
-                <w:rFonts w:ascii="Times New Roman" w:hAnsi="Times New Roman"/>
-                <w:b w:val="0"/>
-                <w:color w:val="000000"/>
-                <w:sz w:val="20"/>
-              </w:rPr>
-              <w:t>2</w:t>
-            </w:r>
-          </w:p>
-        </w:tc>
-        <w:tc>
-          <w:tcPr>
-            <w:tcW w:type="dxa" w:w="2304"/>
-            <w:vAlign w:val="center"/>
-            <w:shd w:fill="F2F6FA"/>
-            <w:tcMar>
-              <w:top w:w="95" w:type="dxa"/>
-              <w:bottom w:w="95" w:type="dxa"/>
-              <w:start w:w="105" w:type="dxa"/>
-              <w:end w:w="105" w:type="dxa"/>
-            </w:tcMar>
-          </w:tcPr>
-          <w:p>
-            <w:pPr>
-              <w:spacing w:after="0" w:line="252" w:lineRule="auto"/>
-              <w:jc w:val="center"/>
-            </w:pPr>
-            <w:r>
-              <w:rPr>
-                <w:rFonts w:ascii="Times New Roman" w:hAnsi="Times New Roman"/>
-                <w:b w:val="0"/>
-                <w:color w:val="000000"/>
-                <w:sz w:val="20"/>
-              </w:rPr>
-              <w:t>eci</w:t>
-            </w:r>
-          </w:p>
-        </w:tc>
-        <w:tc>
-          <w:tcPr>
-            <w:tcW w:type="dxa" w:w="1872"/>
-            <w:vAlign w:val="center"/>
-            <w:shd w:fill="F2F6FA"/>
-            <w:tcMar>
-              <w:top w:w="95" w:type="dxa"/>
-              <w:bottom w:w="95" w:type="dxa"/>
-              <w:start w:w="105" w:type="dxa"/>
-              <w:end w:w="105" w:type="dxa"/>
-            </w:tcMar>
-          </w:tcPr>
-          <w:p>
-            <w:pPr>
-              <w:spacing w:after="0" w:line="252" w:lineRule="auto"/>
-              <w:jc w:val="center"/>
-            </w:pPr>
-            <w:r>
-              <w:rPr>
-                <w:rFonts w:ascii="Times New Roman" w:hAnsi="Times New Roman"/>
-                <w:b w:val="0"/>
-                <w:color w:val="000000"/>
-                <w:sz w:val="20"/>
-              </w:rPr>
-              <w:t>0.0788</w:t>
             </w:r>
           </w:p>
         </w:tc>
@@ -4430,7 +4140,7 @@
         <w:rPr>
           <w:color w:val="000000"/>
         </w:rPr>
-        <w:t>Table 6  Selected ARDL with trend using 49 observations</w:t>
+        <w:t>Table 6  Initial ARDL with trend using 49 observations</w:t>
       </w:r>
     </w:p>
     <w:tbl>
@@ -5208,7 +4918,7 @@
                 <w:color w:val="000000"/>
                 <w:sz w:val="20"/>
               </w:rPr>
-              <w:t>Δunrate lag 1</w:t>
+              <w:t>ΔFLBR_B.IUSA lag 1</w:t>
             </w:r>
           </w:p>
         </w:tc>
@@ -5335,7 +5045,7 @@
         <w:rPr>
           <w:color w:val="000000"/>
         </w:rPr>
-        <w:t>With trend included, unrate enters and no second macro qualifies. The trend coefficient is −0.000807 with p = 0.1719. We remove t and reestimate the same unrate specification. This is a conditional simplification of the forecasting equation; it does not negate the historical trend detected by the static regression. The analysis of the trend model stops at parameter significance.</w:t>
+        <w:t>With trend retained, FLBR_B.IUSA enters and no second macro qualifies. The trend coefficient is −0.000807 (standard error 0.000581; t statistic −1.389; p = 0.1719). Since p exceeds 0.05, we do not reject a zero trend coefficient. We therefore delete t and reestimate, keeping D, EF lag 1 and ΔFLBR_B.IUSA lag 1 on the same 49 observations.</w:t>
       </w:r>
     </w:p>
     <w:p>
@@ -5346,7 +5056,7 @@
         <w:rPr>
           <w:color w:val="000000"/>
         </w:rPr>
-        <w:t>A separate strict search starting without trend selects gap. We therefore distinguish the mechanical selection path from the final judgment-based choice among the unrate, gap and GDP models. Coefficient p values after screening are descriptive and are not adjusted for searching across 22 candidates.</w:t>
+        <w:t>Trend removal follows the coefficient assessment; it is not imposed before estimating the initial ARDL. This conditional simplification does not negate the historical trend in the static regression. The trend model analysis stops at parameter significance. Section 5 presents the reestimated model and then compares alternative macro drivers. Coefficient p values after screening are descriptive and are not adjusted for searching across 22 candidates.</w:t>
       </w:r>
     </w:p>
     <w:p>
@@ -5360,7 +5070,7 @@
         <w:rPr>
           <w:color w:val="000000"/>
         </w:rPr>
-        <w:t>5 Final ARDL and alternative macro models</w:t>
+        <w:t>5 Reestimated ARDL after removing trend</w:t>
       </w:r>
     </w:p>
     <w:p>
@@ -5514,7 +5224,7 @@
         <w:rPr>
           <w:color w:val="000000"/>
         </w:rPr>
-        <w:t>Table 7  Final unrate model estimated through 2023Q3</w:t>
+        <w:t>Table 7  FLBR_B.IUSA ARDL reestimated without trend through 2023Q3</w:t>
       </w:r>
     </w:p>
     <w:tbl>
@@ -6147,7 +5857,7 @@
                 <w:color w:val="000000"/>
                 <w:sz w:val="20"/>
               </w:rPr>
-              <w:t>Δunrate lag 1</w:t>
+              <w:t>ΔFLBR_B.IUSA lag 1</w:t>
             </w:r>
           </w:p>
         </w:tc>
@@ -6436,12 +6146,12 @@
         </w:tblBorders>
       </w:tblPr>
       <w:tblGrid>
+        <w:gridCol w:w="2592"/>
+        <w:gridCol w:w="1440"/>
+        <w:gridCol w:w="1584"/>
+        <w:gridCol w:w="1584"/>
         <w:gridCol w:w="1440"/>
         <w:gridCol w:w="1440"/>
-        <w:gridCol w:w="2016"/>
-        <w:gridCol w:w="1728"/>
-        <w:gridCol w:w="1728"/>
-        <w:gridCol w:w="1728"/>
       </w:tblGrid>
       <w:tr>
         <w:trPr>
@@ -6450,7 +6160,7 @@
         </w:trPr>
         <w:tc>
           <w:tcPr>
-            <w:tcW w:type="dxa" w:w="1440"/>
+            <w:tcW w:type="dxa" w:w="2592"/>
             <w:vAlign w:val="center"/>
             <w:shd w:fill="1F4E78"/>
             <w:tcMar>
@@ -6506,7 +6216,7 @@
         </w:tc>
         <w:tc>
           <w:tcPr>
-            <w:tcW w:type="dxa" w:w="2016"/>
+            <w:tcW w:type="dxa" w:w="1584"/>
             <w:vAlign w:val="center"/>
             <w:shd w:fill="1F4E78"/>
             <w:tcMar>
@@ -6534,7 +6244,7 @@
         </w:tc>
         <w:tc>
           <w:tcPr>
-            <w:tcW w:type="dxa" w:w="1728"/>
+            <w:tcW w:type="dxa" w:w="1584"/>
             <w:vAlign w:val="center"/>
             <w:shd w:fill="1F4E78"/>
             <w:tcMar>
@@ -6562,7 +6272,7 @@
         </w:tc>
         <w:tc>
           <w:tcPr>
-            <w:tcW w:type="dxa" w:w="1728"/>
+            <w:tcW w:type="dxa" w:w="1440"/>
             <w:vAlign w:val="center"/>
             <w:shd w:fill="1F4E78"/>
             <w:tcMar>
@@ -6590,7 +6300,7 @@
         </w:tc>
         <w:tc>
           <w:tcPr>
-            <w:tcW w:type="dxa" w:w="1728"/>
+            <w:tcW w:type="dxa" w:w="1440"/>
             <w:vAlign w:val="center"/>
             <w:shd w:fill="1F4E78"/>
             <w:tcMar>
@@ -6623,6 +6333,34 @@
         </w:trPr>
         <w:tc>
           <w:tcPr>
+            <w:tcW w:type="dxa" w:w="2592"/>
+            <w:vAlign w:val="center"/>
+            <w:shd w:fill="FFFFFF"/>
+            <w:tcMar>
+              <w:top w:w="95" w:type="dxa"/>
+              <w:bottom w:w="95" w:type="dxa"/>
+              <w:start w:w="105" w:type="dxa"/>
+              <w:end w:w="105" w:type="dxa"/>
+            </w:tcMar>
+          </w:tcPr>
+          <w:p>
+            <w:pPr>
+              <w:spacing w:after="0" w:line="252" w:lineRule="auto"/>
+              <w:jc w:val="left"/>
+            </w:pPr>
+            <w:r>
+              <w:rPr>
+                <w:rFonts w:ascii="Times New Roman" w:hAnsi="Times New Roman"/>
+                <w:b w:val="0"/>
+                <w:color w:val="000000"/>
+                <w:sz w:val="20"/>
+              </w:rPr>
+              <w:t>FLBR_B.IUSA</w:t>
+            </w:r>
+          </w:p>
+        </w:tc>
+        <w:tc>
+          <w:tcPr>
             <w:tcW w:type="dxa" w:w="1440"/>
             <w:vAlign w:val="center"/>
             <w:shd w:fill="FFFFFF"/>
@@ -6636,16 +6374,72 @@
           <w:p>
             <w:pPr>
               <w:spacing w:after="0" w:line="252" w:lineRule="auto"/>
-              <w:jc w:val="left"/>
-            </w:pPr>
-            <w:r>
-              <w:rPr>
-                <w:rFonts w:ascii="Times New Roman" w:hAnsi="Times New Roman"/>
-                <w:b w:val="0"/>
-                <w:color w:val="000000"/>
-                <w:sz w:val="20"/>
-              </w:rPr>
-              <w:t>unrate</w:t>
+              <w:jc w:val="center"/>
+            </w:pPr>
+            <w:r>
+              <w:rPr>
+                <w:rFonts w:ascii="Times New Roman" w:hAnsi="Times New Roman"/>
+                <w:b w:val="0"/>
+                <w:color w:val="000000"/>
+                <w:sz w:val="20"/>
+              </w:rPr>
+              <w:t>0.0289</w:t>
+            </w:r>
+          </w:p>
+        </w:tc>
+        <w:tc>
+          <w:tcPr>
+            <w:tcW w:type="dxa" w:w="1584"/>
+            <w:vAlign w:val="center"/>
+            <w:shd w:fill="FFFFFF"/>
+            <w:tcMar>
+              <w:top w:w="95" w:type="dxa"/>
+              <w:bottom w:w="95" w:type="dxa"/>
+              <w:start w:w="105" w:type="dxa"/>
+              <w:end w:w="105" w:type="dxa"/>
+            </w:tcMar>
+          </w:tcPr>
+          <w:p>
+            <w:pPr>
+              <w:spacing w:after="0" w:line="252" w:lineRule="auto"/>
+              <w:jc w:val="center"/>
+            </w:pPr>
+            <w:r>
+              <w:rPr>
+                <w:rFonts w:ascii="Times New Roman" w:hAnsi="Times New Roman"/>
+                <w:b w:val="0"/>
+                <w:color w:val="000000"/>
+                <w:sz w:val="20"/>
+              </w:rPr>
+              <w:t>0.826462</w:t>
+            </w:r>
+          </w:p>
+        </w:tc>
+        <w:tc>
+          <w:tcPr>
+            <w:tcW w:type="dxa" w:w="1584"/>
+            <w:vAlign w:val="center"/>
+            <w:shd w:fill="FFFFFF"/>
+            <w:tcMar>
+              <w:top w:w="95" w:type="dxa"/>
+              <w:bottom w:w="95" w:type="dxa"/>
+              <w:start w:w="105" w:type="dxa"/>
+              <w:end w:w="105" w:type="dxa"/>
+            </w:tcMar>
+          </w:tcPr>
+          <w:p>
+            <w:pPr>
+              <w:spacing w:after="0" w:line="252" w:lineRule="auto"/>
+              <w:jc w:val="center"/>
+            </w:pPr>
+            <w:r>
+              <w:rPr>
+                <w:rFonts w:ascii="Times New Roman" w:hAnsi="Times New Roman"/>
+                <w:b w:val="0"/>
+                <w:color w:val="000000"/>
+                <w:sz w:val="20"/>
+              </w:rPr>
+              <w:t>0.02833</w:t>
             </w:r>
           </w:p>
         </w:tc>
@@ -6673,97 +6467,13 @@
                 <w:color w:val="000000"/>
                 <w:sz w:val="20"/>
               </w:rPr>
-              <w:t>0.0289</w:t>
-            </w:r>
-          </w:p>
-        </w:tc>
-        <w:tc>
-          <w:tcPr>
-            <w:tcW w:type="dxa" w:w="2016"/>
-            <w:vAlign w:val="center"/>
-            <w:shd w:fill="FFFFFF"/>
-            <w:tcMar>
-              <w:top w:w="95" w:type="dxa"/>
-              <w:bottom w:w="95" w:type="dxa"/>
-              <w:start w:w="105" w:type="dxa"/>
-              <w:end w:w="105" w:type="dxa"/>
-            </w:tcMar>
-          </w:tcPr>
-          <w:p>
-            <w:pPr>
-              <w:spacing w:after="0" w:line="252" w:lineRule="auto"/>
-              <w:jc w:val="center"/>
-            </w:pPr>
-            <w:r>
-              <w:rPr>
-                <w:rFonts w:ascii="Times New Roman" w:hAnsi="Times New Roman"/>
-                <w:b w:val="0"/>
-                <w:color w:val="000000"/>
-                <w:sz w:val="20"/>
-              </w:rPr>
-              <w:t>0.826462</w:t>
-            </w:r>
-          </w:p>
-        </w:tc>
-        <w:tc>
-          <w:tcPr>
-            <w:tcW w:type="dxa" w:w="1728"/>
-            <w:vAlign w:val="center"/>
-            <w:shd w:fill="FFFFFF"/>
-            <w:tcMar>
-              <w:top w:w="95" w:type="dxa"/>
-              <w:bottom w:w="95" w:type="dxa"/>
-              <w:start w:w="105" w:type="dxa"/>
-              <w:end w:w="105" w:type="dxa"/>
-            </w:tcMar>
-          </w:tcPr>
-          <w:p>
-            <w:pPr>
-              <w:spacing w:after="0" w:line="252" w:lineRule="auto"/>
-              <w:jc w:val="center"/>
-            </w:pPr>
-            <w:r>
-              <w:rPr>
-                <w:rFonts w:ascii="Times New Roman" w:hAnsi="Times New Roman"/>
-                <w:b w:val="0"/>
-                <w:color w:val="000000"/>
-                <w:sz w:val="20"/>
-              </w:rPr>
-              <w:t>0.02833</w:t>
-            </w:r>
-          </w:p>
-        </w:tc>
-        <w:tc>
-          <w:tcPr>
-            <w:tcW w:type="dxa" w:w="1728"/>
-            <w:vAlign w:val="center"/>
-            <w:shd w:fill="FFFFFF"/>
-            <w:tcMar>
-              <w:top w:w="95" w:type="dxa"/>
-              <w:bottom w:w="95" w:type="dxa"/>
-              <w:start w:w="105" w:type="dxa"/>
-              <w:end w:w="105" w:type="dxa"/>
-            </w:tcMar>
-          </w:tcPr>
-          <w:p>
-            <w:pPr>
-              <w:spacing w:after="0" w:line="252" w:lineRule="auto"/>
-              <w:jc w:val="center"/>
-            </w:pPr>
-            <w:r>
-              <w:rPr>
-                <w:rFonts w:ascii="Times New Roman" w:hAnsi="Times New Roman"/>
-                <w:b w:val="0"/>
-                <w:color w:val="000000"/>
-                <w:sz w:val="20"/>
-              </w:rPr>
               <w:t>−202.205</w:t>
             </w:r>
           </w:p>
         </w:tc>
         <w:tc>
           <w:tcPr>
-            <w:tcW w:type="dxa" w:w="1728"/>
+            <w:tcW w:type="dxa" w:w="1440"/>
             <w:vAlign w:val="center"/>
             <w:shd w:fill="FFFFFF"/>
             <w:tcMar>
@@ -6796,6 +6506,34 @@
         </w:trPr>
         <w:tc>
           <w:tcPr>
+            <w:tcW w:type="dxa" w:w="2592"/>
+            <w:vAlign w:val="center"/>
+            <w:shd w:fill="F2F6FA"/>
+            <w:tcMar>
+              <w:top w:w="95" w:type="dxa"/>
+              <w:bottom w:w="95" w:type="dxa"/>
+              <w:start w:w="105" w:type="dxa"/>
+              <w:end w:w="105" w:type="dxa"/>
+            </w:tcMar>
+          </w:tcPr>
+          <w:p>
+            <w:pPr>
+              <w:spacing w:after="0" w:line="252" w:lineRule="auto"/>
+              <w:jc w:val="left"/>
+            </w:pPr>
+            <w:r>
+              <w:rPr>
+                <w:rFonts w:ascii="Times New Roman" w:hAnsi="Times New Roman"/>
+                <w:b w:val="0"/>
+                <w:color w:val="000000"/>
+                <w:sz w:val="20"/>
+              </w:rPr>
+              <w:t>FGAP_B.IUSA</w:t>
+            </w:r>
+          </w:p>
+        </w:tc>
+        <w:tc>
+          <w:tcPr>
             <w:tcW w:type="dxa" w:w="1440"/>
             <w:vAlign w:val="center"/>
             <w:shd w:fill="F2F6FA"/>
@@ -6809,16 +6547,72 @@
           <w:p>
             <w:pPr>
               <w:spacing w:after="0" w:line="252" w:lineRule="auto"/>
-              <w:jc w:val="left"/>
-            </w:pPr>
-            <w:r>
-              <w:rPr>
-                <w:rFonts w:ascii="Times New Roman" w:hAnsi="Times New Roman"/>
-                <w:b w:val="0"/>
-                <w:color w:val="000000"/>
-                <w:sz w:val="20"/>
-              </w:rPr>
-              <w:t>gap</w:t>
+              <w:jc w:val="center"/>
+            </w:pPr>
+            <w:r>
+              <w:rPr>
+                <w:rFonts w:ascii="Times New Roman" w:hAnsi="Times New Roman"/>
+                <w:b w:val="0"/>
+                <w:color w:val="000000"/>
+                <w:sz w:val="20"/>
+              </w:rPr>
+              <w:t>0.0267</w:t>
+            </w:r>
+          </w:p>
+        </w:tc>
+        <w:tc>
+          <w:tcPr>
+            <w:tcW w:type="dxa" w:w="1584"/>
+            <w:vAlign w:val="center"/>
+            <w:shd w:fill="F2F6FA"/>
+            <w:tcMar>
+              <w:top w:w="95" w:type="dxa"/>
+              <w:bottom w:w="95" w:type="dxa"/>
+              <w:start w:w="105" w:type="dxa"/>
+              <w:end w:w="105" w:type="dxa"/>
+            </w:tcMar>
+          </w:tcPr>
+          <w:p>
+            <w:pPr>
+              <w:spacing w:after="0" w:line="252" w:lineRule="auto"/>
+              <w:jc w:val="center"/>
+            </w:pPr>
+            <w:r>
+              <w:rPr>
+                <w:rFonts w:ascii="Times New Roman" w:hAnsi="Times New Roman"/>
+                <w:b w:val="0"/>
+                <w:color w:val="000000"/>
+                <w:sz w:val="20"/>
+              </w:rPr>
+              <w:t>0.826998</w:t>
+            </w:r>
+          </w:p>
+        </w:tc>
+        <w:tc>
+          <w:tcPr>
+            <w:tcW w:type="dxa" w:w="1584"/>
+            <w:vAlign w:val="center"/>
+            <w:shd w:fill="F2F6FA"/>
+            <w:tcMar>
+              <w:top w:w="95" w:type="dxa"/>
+              <w:bottom w:w="95" w:type="dxa"/>
+              <w:start w:w="105" w:type="dxa"/>
+              <w:end w:w="105" w:type="dxa"/>
+            </w:tcMar>
+          </w:tcPr>
+          <w:p>
+            <w:pPr>
+              <w:spacing w:after="0" w:line="252" w:lineRule="auto"/>
+              <w:jc w:val="center"/>
+            </w:pPr>
+            <w:r>
+              <w:rPr>
+                <w:rFonts w:ascii="Times New Roman" w:hAnsi="Times New Roman"/>
+                <w:b w:val="0"/>
+                <w:color w:val="000000"/>
+                <w:sz w:val="20"/>
+              </w:rPr>
+              <w:t>0.02828</w:t>
             </w:r>
           </w:p>
         </w:tc>
@@ -6846,97 +6640,13 @@
                 <w:color w:val="000000"/>
                 <w:sz w:val="20"/>
               </w:rPr>
-              <w:t>0.0267</w:t>
-            </w:r>
-          </w:p>
-        </w:tc>
-        <w:tc>
-          <w:tcPr>
-            <w:tcW w:type="dxa" w:w="2016"/>
-            <w:vAlign w:val="center"/>
-            <w:shd w:fill="F2F6FA"/>
-            <w:tcMar>
-              <w:top w:w="95" w:type="dxa"/>
-              <w:bottom w:w="95" w:type="dxa"/>
-              <w:start w:w="105" w:type="dxa"/>
-              <w:end w:w="105" w:type="dxa"/>
-            </w:tcMar>
-          </w:tcPr>
-          <w:p>
-            <w:pPr>
-              <w:spacing w:after="0" w:line="252" w:lineRule="auto"/>
-              <w:jc w:val="center"/>
-            </w:pPr>
-            <w:r>
-              <w:rPr>
-                <w:rFonts w:ascii="Times New Roman" w:hAnsi="Times New Roman"/>
-                <w:b w:val="0"/>
-                <w:color w:val="000000"/>
-                <w:sz w:val="20"/>
-              </w:rPr>
-              <w:t>0.826998</w:t>
-            </w:r>
-          </w:p>
-        </w:tc>
-        <w:tc>
-          <w:tcPr>
-            <w:tcW w:type="dxa" w:w="1728"/>
-            <w:vAlign w:val="center"/>
-            <w:shd w:fill="F2F6FA"/>
-            <w:tcMar>
-              <w:top w:w="95" w:type="dxa"/>
-              <w:bottom w:w="95" w:type="dxa"/>
-              <w:start w:w="105" w:type="dxa"/>
-              <w:end w:w="105" w:type="dxa"/>
-            </w:tcMar>
-          </w:tcPr>
-          <w:p>
-            <w:pPr>
-              <w:spacing w:after="0" w:line="252" w:lineRule="auto"/>
-              <w:jc w:val="center"/>
-            </w:pPr>
-            <w:r>
-              <w:rPr>
-                <w:rFonts w:ascii="Times New Roman" w:hAnsi="Times New Roman"/>
-                <w:b w:val="0"/>
-                <w:color w:val="000000"/>
-                <w:sz w:val="20"/>
-              </w:rPr>
-              <w:t>0.02828</w:t>
-            </w:r>
-          </w:p>
-        </w:tc>
-        <w:tc>
-          <w:tcPr>
-            <w:tcW w:type="dxa" w:w="1728"/>
-            <w:vAlign w:val="center"/>
-            <w:shd w:fill="F2F6FA"/>
-            <w:tcMar>
-              <w:top w:w="95" w:type="dxa"/>
-              <w:bottom w:w="95" w:type="dxa"/>
-              <w:start w:w="105" w:type="dxa"/>
-              <w:end w:w="105" w:type="dxa"/>
-            </w:tcMar>
-          </w:tcPr>
-          <w:p>
-            <w:pPr>
-              <w:spacing w:after="0" w:line="252" w:lineRule="auto"/>
-              <w:jc w:val="center"/>
-            </w:pPr>
-            <w:r>
-              <w:rPr>
-                <w:rFonts w:ascii="Times New Roman" w:hAnsi="Times New Roman"/>
-                <w:b w:val="0"/>
-                <w:color w:val="000000"/>
-                <w:sz w:val="20"/>
-              </w:rPr>
               <w:t>−202.357</w:t>
             </w:r>
           </w:p>
         </w:tc>
         <w:tc>
           <w:tcPr>
-            <w:tcW w:type="dxa" w:w="1728"/>
+            <w:tcW w:type="dxa" w:w="1440"/>
             <w:vAlign w:val="center"/>
             <w:shd w:fill="F2F6FA"/>
             <w:tcMar>
@@ -6969,6 +6679,34 @@
         </w:trPr>
         <w:tc>
           <w:tcPr>
+            <w:tcW w:type="dxa" w:w="2592"/>
+            <w:vAlign w:val="center"/>
+            <w:shd w:fill="FFFFFF"/>
+            <w:tcMar>
+              <w:top w:w="95" w:type="dxa"/>
+              <w:bottom w:w="95" w:type="dxa"/>
+              <w:start w:w="105" w:type="dxa"/>
+              <w:end w:w="105" w:type="dxa"/>
+            </w:tcMar>
+          </w:tcPr>
+          <w:p>
+            <w:pPr>
+              <w:spacing w:after="0" w:line="252" w:lineRule="auto"/>
+              <w:jc w:val="left"/>
+            </w:pPr>
+            <w:r>
+              <w:rPr>
+                <w:rFonts w:ascii="Times New Roman" w:hAnsi="Times New Roman"/>
+                <w:b w:val="0"/>
+                <w:color w:val="000000"/>
+                <w:sz w:val="20"/>
+              </w:rPr>
+              <w:t>FGDP$_B.IUSA</w:t>
+            </w:r>
+          </w:p>
+        </w:tc>
+        <w:tc>
+          <w:tcPr>
             <w:tcW w:type="dxa" w:w="1440"/>
             <w:vAlign w:val="center"/>
             <w:shd w:fill="FFFFFF"/>
@@ -6982,16 +6720,72 @@
           <w:p>
             <w:pPr>
               <w:spacing w:after="0" w:line="252" w:lineRule="auto"/>
-              <w:jc w:val="left"/>
-            </w:pPr>
-            <w:r>
-              <w:rPr>
-                <w:rFonts w:ascii="Times New Roman" w:hAnsi="Times New Roman"/>
-                <w:b w:val="0"/>
-                <w:color w:val="000000"/>
-                <w:sz w:val="20"/>
-              </w:rPr>
-              <w:t>gdp</w:t>
+              <w:jc w:val="center"/>
+            </w:pPr>
+            <w:r>
+              <w:rPr>
+                <w:rFonts w:ascii="Times New Roman" w:hAnsi="Times New Roman"/>
+                <w:b w:val="0"/>
+                <w:color w:val="000000"/>
+                <w:sz w:val="20"/>
+              </w:rPr>
+              <w:t>0.0277</w:t>
+            </w:r>
+          </w:p>
+        </w:tc>
+        <w:tc>
+          <w:tcPr>
+            <w:tcW w:type="dxa" w:w="1584"/>
+            <w:vAlign w:val="center"/>
+            <w:shd w:fill="FFFFFF"/>
+            <w:tcMar>
+              <w:top w:w="95" w:type="dxa"/>
+              <w:bottom w:w="95" w:type="dxa"/>
+              <w:start w:w="105" w:type="dxa"/>
+              <w:end w:w="105" w:type="dxa"/>
+            </w:tcMar>
+          </w:tcPr>
+          <w:p>
+            <w:pPr>
+              <w:spacing w:after="0" w:line="252" w:lineRule="auto"/>
+              <w:jc w:val="center"/>
+            </w:pPr>
+            <w:r>
+              <w:rPr>
+                <w:rFonts w:ascii="Times New Roman" w:hAnsi="Times New Roman"/>
+                <w:b w:val="0"/>
+                <w:color w:val="000000"/>
+                <w:sz w:val="20"/>
+              </w:rPr>
+              <w:t>0.826748</w:t>
+            </w:r>
+          </w:p>
+        </w:tc>
+        <w:tc>
+          <w:tcPr>
+            <w:tcW w:type="dxa" w:w="1584"/>
+            <w:vAlign w:val="center"/>
+            <w:shd w:fill="FFFFFF"/>
+            <w:tcMar>
+              <w:top w:w="95" w:type="dxa"/>
+              <w:bottom w:w="95" w:type="dxa"/>
+              <w:start w:w="105" w:type="dxa"/>
+              <w:end w:w="105" w:type="dxa"/>
+            </w:tcMar>
+          </w:tcPr>
+          <w:p>
+            <w:pPr>
+              <w:spacing w:after="0" w:line="252" w:lineRule="auto"/>
+              <w:jc w:val="center"/>
+            </w:pPr>
+            <w:r>
+              <w:rPr>
+                <w:rFonts w:ascii="Times New Roman" w:hAnsi="Times New Roman"/>
+                <w:b w:val="0"/>
+                <w:color w:val="000000"/>
+                <w:sz w:val="20"/>
+              </w:rPr>
+              <w:t>0.02830</w:t>
             </w:r>
           </w:p>
         </w:tc>
@@ -7019,97 +6813,13 @@
                 <w:color w:val="000000"/>
                 <w:sz w:val="20"/>
               </w:rPr>
-              <w:t>0.0277</w:t>
-            </w:r>
-          </w:p>
-        </w:tc>
-        <w:tc>
-          <w:tcPr>
-            <w:tcW w:type="dxa" w:w="2016"/>
-            <w:vAlign w:val="center"/>
-            <w:shd w:fill="FFFFFF"/>
-            <w:tcMar>
-              <w:top w:w="95" w:type="dxa"/>
-              <w:bottom w:w="95" w:type="dxa"/>
-              <w:start w:w="105" w:type="dxa"/>
-              <w:end w:w="105" w:type="dxa"/>
-            </w:tcMar>
-          </w:tcPr>
-          <w:p>
-            <w:pPr>
-              <w:spacing w:after="0" w:line="252" w:lineRule="auto"/>
-              <w:jc w:val="center"/>
-            </w:pPr>
-            <w:r>
-              <w:rPr>
-                <w:rFonts w:ascii="Times New Roman" w:hAnsi="Times New Roman"/>
-                <w:b w:val="0"/>
-                <w:color w:val="000000"/>
-                <w:sz w:val="20"/>
-              </w:rPr>
-              <w:t>0.826748</w:t>
-            </w:r>
-          </w:p>
-        </w:tc>
-        <w:tc>
-          <w:tcPr>
-            <w:tcW w:type="dxa" w:w="1728"/>
-            <w:vAlign w:val="center"/>
-            <w:shd w:fill="FFFFFF"/>
-            <w:tcMar>
-              <w:top w:w="95" w:type="dxa"/>
-              <w:bottom w:w="95" w:type="dxa"/>
-              <w:start w:w="105" w:type="dxa"/>
-              <w:end w:w="105" w:type="dxa"/>
-            </w:tcMar>
-          </w:tcPr>
-          <w:p>
-            <w:pPr>
-              <w:spacing w:after="0" w:line="252" w:lineRule="auto"/>
-              <w:jc w:val="center"/>
-            </w:pPr>
-            <w:r>
-              <w:rPr>
-                <w:rFonts w:ascii="Times New Roman" w:hAnsi="Times New Roman"/>
-                <w:b w:val="0"/>
-                <w:color w:val="000000"/>
-                <w:sz w:val="20"/>
-              </w:rPr>
-              <w:t>0.02830</w:t>
-            </w:r>
-          </w:p>
-        </w:tc>
-        <w:tc>
-          <w:tcPr>
-            <w:tcW w:type="dxa" w:w="1728"/>
-            <w:vAlign w:val="center"/>
-            <w:shd w:fill="FFFFFF"/>
-            <w:tcMar>
-              <w:top w:w="95" w:type="dxa"/>
-              <w:bottom w:w="95" w:type="dxa"/>
-              <w:start w:w="105" w:type="dxa"/>
-              <w:end w:w="105" w:type="dxa"/>
-            </w:tcMar>
-          </w:tcPr>
-          <w:p>
-            <w:pPr>
-              <w:spacing w:after="0" w:line="252" w:lineRule="auto"/>
-              <w:jc w:val="center"/>
-            </w:pPr>
-            <w:r>
-              <w:rPr>
-                <w:rFonts w:ascii="Times New Roman" w:hAnsi="Times New Roman"/>
-                <w:b w:val="0"/>
-                <w:color w:val="000000"/>
-                <w:sz w:val="20"/>
-              </w:rPr>
               <w:t>−202.286</w:t>
             </w:r>
           </w:p>
         </w:tc>
         <w:tc>
           <w:tcPr>
-            <w:tcW w:type="dxa" w:w="1728"/>
+            <w:tcW w:type="dxa" w:w="1440"/>
             <w:vAlign w:val="center"/>
             <w:shd w:fill="FFFFFF"/>
             <w:tcMar>
@@ -7146,7 +6856,7 @@
         <w:rPr>
           <w:color w:val="000000"/>
         </w:rPr>
-        <w:t>All three models use 49 observations and four coefficients. Adjusted R² ranges from 0.826462 to 0.826998. The largest AIC difference is 0.152. These are small descriptive differences in fit; they are not a formal statistical equivalence result. The GDP regressor is a log change, while gap and unrate are level differences, so their coefficient magnitudes are not directly comparable.</w:t>
+        <w:t>All three models use 49 observations and four coefficients. Adjusted R² ranges from 0.826462 to 0.826998. The largest AIC difference is 0.152. These are small descriptive differences, not a formal equivalence result. FGDP$_B.IUSA enters as a log change; FGAP_B.IUSA and FLBR_B.IUSA enter as level differences. Their coefficient magnitudes are therefore not directly comparable.</w:t>
       </w:r>
     </w:p>
     <w:p>
@@ -7157,7 +6867,7 @@
         <w:rPr>
           <w:color w:val="000000"/>
         </w:rPr>
-        <w:t>Gap, GDP and unrate are the three lowest-p no-trend candidates. ECI also passes the single-macro screen at p = 0.0473, but its conditional p value after unrate is 0.1122. No additional macro qualifies once unrate is retained.</w:t>
+        <w:t>After trend removal, a separate strict screen selects FGAP_B.IUSA. FGAP_B.IUSA, FGDP$_B.IUSA and FLBR_B.IUSA have the three lowest entry p values. FECICPQ_B.IUSA also passes the single-macro screen (p = 0.0473), but its conditional p after FLBR_B.IUSA is 0.1122. No additional macro qualifies once FLBR_B.IUSA is retained.</w:t>
       </w:r>
     </w:p>
     <w:p>
@@ -7187,11 +6897,11 @@
         </w:tblBorders>
       </w:tblPr>
       <w:tblGrid>
-        <w:gridCol w:w="2016"/>
-        <w:gridCol w:w="2016"/>
-        <w:gridCol w:w="2016"/>
-        <w:gridCol w:w="2016"/>
-        <w:gridCol w:w="2016"/>
+        <w:gridCol w:w="2592"/>
+        <w:gridCol w:w="1872"/>
+        <w:gridCol w:w="1872"/>
+        <w:gridCol w:w="1872"/>
+        <w:gridCol w:w="1872"/>
       </w:tblGrid>
       <w:tr>
         <w:trPr>
@@ -7200,7 +6910,7 @@
         </w:trPr>
         <w:tc>
           <w:tcPr>
-            <w:tcW w:type="dxa" w:w="2016"/>
+            <w:tcW w:type="dxa" w:w="2592"/>
             <w:vAlign w:val="center"/>
             <w:shd w:fill="1F4E78"/>
             <w:tcMar>
@@ -7228,7 +6938,7 @@
         </w:tc>
         <w:tc>
           <w:tcPr>
-            <w:tcW w:type="dxa" w:w="2016"/>
+            <w:tcW w:type="dxa" w:w="1872"/>
             <w:vAlign w:val="center"/>
             <w:shd w:fill="1F4E78"/>
             <w:tcMar>
@@ -7256,7 +6966,7 @@
         </w:tc>
         <w:tc>
           <w:tcPr>
-            <w:tcW w:type="dxa" w:w="2016"/>
+            <w:tcW w:type="dxa" w:w="1872"/>
             <w:vAlign w:val="center"/>
             <w:shd w:fill="1F4E78"/>
             <w:tcMar>
@@ -7284,7 +6994,7 @@
         </w:tc>
         <w:tc>
           <w:tcPr>
-            <w:tcW w:type="dxa" w:w="2016"/>
+            <w:tcW w:type="dxa" w:w="1872"/>
             <w:vAlign w:val="center"/>
             <w:shd w:fill="1F4E78"/>
             <w:tcMar>
@@ -7312,7 +7022,7 @@
         </w:tc>
         <w:tc>
           <w:tcPr>
-            <w:tcW w:type="dxa" w:w="2016"/>
+            <w:tcW w:type="dxa" w:w="1872"/>
             <w:vAlign w:val="center"/>
             <w:shd w:fill="1F4E78"/>
             <w:tcMar>
@@ -7345,7 +7055,7 @@
         </w:trPr>
         <w:tc>
           <w:tcPr>
-            <w:tcW w:type="dxa" w:w="2016"/>
+            <w:tcW w:type="dxa" w:w="2592"/>
             <w:vAlign w:val="center"/>
             <w:shd w:fill="FFFFFF"/>
             <w:tcMar>
@@ -7367,13 +7077,13 @@
                 <w:color w:val="000000"/>
                 <w:sz w:val="20"/>
               </w:rPr>
-              <w:t>unrate</w:t>
-            </w:r>
-          </w:p>
-        </w:tc>
-        <w:tc>
-          <w:tcPr>
-            <w:tcW w:type="dxa" w:w="2016"/>
+              <w:t>FLBR_B.IUSA</w:t>
+            </w:r>
+          </w:p>
+        </w:tc>
+        <w:tc>
+          <w:tcPr>
+            <w:tcW w:type="dxa" w:w="1872"/>
             <w:vAlign w:val="center"/>
             <w:shd w:fill="FFFFFF"/>
             <w:tcMar>
@@ -7401,7 +7111,7 @@
         </w:tc>
         <w:tc>
           <w:tcPr>
-            <w:tcW w:type="dxa" w:w="2016"/>
+            <w:tcW w:type="dxa" w:w="1872"/>
             <w:vAlign w:val="center"/>
             <w:shd w:fill="FFFFFF"/>
             <w:tcMar>
@@ -7429,7 +7139,7 @@
         </w:tc>
         <w:tc>
           <w:tcPr>
-            <w:tcW w:type="dxa" w:w="2016"/>
+            <w:tcW w:type="dxa" w:w="1872"/>
             <w:vAlign w:val="center"/>
             <w:shd w:fill="FFFFFF"/>
             <w:tcMar>
@@ -7457,7 +7167,7 @@
         </w:tc>
         <w:tc>
           <w:tcPr>
-            <w:tcW w:type="dxa" w:w="2016"/>
+            <w:tcW w:type="dxa" w:w="1872"/>
             <w:vAlign w:val="center"/>
             <w:shd w:fill="FFFFFF"/>
             <w:tcMar>
@@ -7490,7 +7200,7 @@
         </w:trPr>
         <w:tc>
           <w:tcPr>
-            <w:tcW w:type="dxa" w:w="2016"/>
+            <w:tcW w:type="dxa" w:w="2592"/>
             <w:vAlign w:val="center"/>
             <w:shd w:fill="F2F6FA"/>
             <w:tcMar>
@@ -7512,13 +7222,13 @@
                 <w:color w:val="000000"/>
                 <w:sz w:val="20"/>
               </w:rPr>
-              <w:t>gap</w:t>
-            </w:r>
-          </w:p>
-        </w:tc>
-        <w:tc>
-          <w:tcPr>
-            <w:tcW w:type="dxa" w:w="2016"/>
+              <w:t>FGAP_B.IUSA</w:t>
+            </w:r>
+          </w:p>
+        </w:tc>
+        <w:tc>
+          <w:tcPr>
+            <w:tcW w:type="dxa" w:w="1872"/>
             <w:vAlign w:val="center"/>
             <w:shd w:fill="F2F6FA"/>
             <w:tcMar>
@@ -7546,7 +7256,7 @@
         </w:tc>
         <w:tc>
           <w:tcPr>
-            <w:tcW w:type="dxa" w:w="2016"/>
+            <w:tcW w:type="dxa" w:w="1872"/>
             <w:vAlign w:val="center"/>
             <w:shd w:fill="F2F6FA"/>
             <w:tcMar>
@@ -7574,7 +7284,7 @@
         </w:tc>
         <w:tc>
           <w:tcPr>
-            <w:tcW w:type="dxa" w:w="2016"/>
+            <w:tcW w:type="dxa" w:w="1872"/>
             <w:vAlign w:val="center"/>
             <w:shd w:fill="F2F6FA"/>
             <w:tcMar>
@@ -7602,7 +7312,7 @@
         </w:tc>
         <w:tc>
           <w:tcPr>
-            <w:tcW w:type="dxa" w:w="2016"/>
+            <w:tcW w:type="dxa" w:w="1872"/>
             <w:vAlign w:val="center"/>
             <w:shd w:fill="F2F6FA"/>
             <w:tcMar>
@@ -7635,7 +7345,7 @@
         </w:trPr>
         <w:tc>
           <w:tcPr>
-            <w:tcW w:type="dxa" w:w="2016"/>
+            <w:tcW w:type="dxa" w:w="2592"/>
             <w:vAlign w:val="center"/>
             <w:shd w:fill="FFFFFF"/>
             <w:tcMar>
@@ -7657,13 +7367,13 @@
                 <w:color w:val="000000"/>
                 <w:sz w:val="20"/>
               </w:rPr>
-              <w:t>gdp</w:t>
-            </w:r>
-          </w:p>
-        </w:tc>
-        <w:tc>
-          <w:tcPr>
-            <w:tcW w:type="dxa" w:w="2016"/>
+              <w:t>FGDP$_B.IUSA</w:t>
+            </w:r>
+          </w:p>
+        </w:tc>
+        <w:tc>
+          <w:tcPr>
+            <w:tcW w:type="dxa" w:w="1872"/>
             <w:vAlign w:val="center"/>
             <w:shd w:fill="FFFFFF"/>
             <w:tcMar>
@@ -7691,7 +7401,7 @@
         </w:tc>
         <w:tc>
           <w:tcPr>
-            <w:tcW w:type="dxa" w:w="2016"/>
+            <w:tcW w:type="dxa" w:w="1872"/>
             <w:vAlign w:val="center"/>
             <w:shd w:fill="FFFFFF"/>
             <w:tcMar>
@@ -7719,7 +7429,7 @@
         </w:tc>
         <w:tc>
           <w:tcPr>
-            <w:tcW w:type="dxa" w:w="2016"/>
+            <w:tcW w:type="dxa" w:w="1872"/>
             <w:vAlign w:val="center"/>
             <w:shd w:fill="FFFFFF"/>
             <w:tcMar>
@@ -7747,7 +7457,7 @@
         </w:tc>
         <w:tc>
           <w:tcPr>
-            <w:tcW w:type="dxa" w:w="2016"/>
+            <w:tcW w:type="dxa" w:w="1872"/>
             <w:vAlign w:val="center"/>
             <w:shd w:fill="FFFFFF"/>
             <w:tcMar>
@@ -7784,7 +7494,7 @@
         <w:rPr>
           <w:color w:val="000000"/>
         </w:rPr>
-        <w:t>We retain unrate because the statistical fit is comparable, its one-step validation error is lowest, and unemployment provides a clear interpretation for macroeconomic scenarios. A positive unemployment-change coefficient is consistent with higher costs relative to income during weaker labor-market conditions. This is an economic interpretation of a conditional association, not a causal estimate. Recursive forecast performance remains part of the comparison in Section 7.</w:t>
+        <w:t>We retain FLBR_B.IUSA because fit is comparable, one-step validation error is lowest, and unemployment gives a clear scenario interpretation. Its positive change coefficient is consistent with higher costs relative to income in weaker labor markets. This is a conditional association, not a causal estimate. Section 7 also compares recursive forecasts.</w:t>
       </w:r>
     </w:p>
     <w:p>
@@ -7809,7 +7519,7 @@
         <w:rPr>
           <w:color w:val="000000"/>
         </w:rPr>
-        <w:t>The following checks apply to the final unrate specification. Development results use the fixed 49-observation sample. The full-history column checks the same specification after refitting through 2025Q4, with 58 observations. No observations are removed in response to these diagnostics.</w:t>
+        <w:t>These checks apply to the final FLBR_B.IUSA specification. Development results use the fixed 49-observation sample. The full-history column checks the same specification after refitting through 2025Q4, with 58 observations. No observations are removed in response to these diagnostics.</w:t>
       </w:r>
     </w:p>
     <w:p>
@@ -9775,11 +9485,11 @@
         </w:tblBorders>
       </w:tblPr>
       <w:tblGrid>
-        <w:gridCol w:w="1440"/>
-        <w:gridCol w:w="2160"/>
-        <w:gridCol w:w="2160"/>
-        <w:gridCol w:w="2160"/>
-        <w:gridCol w:w="2160"/>
+        <w:gridCol w:w="2592"/>
+        <w:gridCol w:w="1872"/>
+        <w:gridCol w:w="1872"/>
+        <w:gridCol w:w="1872"/>
+        <w:gridCol w:w="1872"/>
       </w:tblGrid>
       <w:tr>
         <w:trPr>
@@ -9788,7 +9498,7 @@
         </w:trPr>
         <w:tc>
           <w:tcPr>
-            <w:tcW w:type="dxa" w:w="1440"/>
+            <w:tcW w:type="dxa" w:w="2592"/>
             <w:vAlign w:val="center"/>
             <w:shd w:fill="1F4E78"/>
             <w:tcMar>
@@ -9816,7 +9526,7 @@
         </w:tc>
         <w:tc>
           <w:tcPr>
-            <w:tcW w:type="dxa" w:w="2160"/>
+            <w:tcW w:type="dxa" w:w="1872"/>
             <w:vAlign w:val="center"/>
             <w:shd w:fill="1F4E78"/>
             <w:tcMar>
@@ -9844,7 +9554,7 @@
         </w:tc>
         <w:tc>
           <w:tcPr>
-            <w:tcW w:type="dxa" w:w="2160"/>
+            <w:tcW w:type="dxa" w:w="1872"/>
             <w:vAlign w:val="center"/>
             <w:shd w:fill="1F4E78"/>
             <w:tcMar>
@@ -9872,7 +9582,7 @@
         </w:tc>
         <w:tc>
           <w:tcPr>
-            <w:tcW w:type="dxa" w:w="2160"/>
+            <w:tcW w:type="dxa" w:w="1872"/>
             <w:vAlign w:val="center"/>
             <w:shd w:fill="1F4E78"/>
             <w:tcMar>
@@ -9900,7 +9610,7 @@
         </w:tc>
         <w:tc>
           <w:tcPr>
-            <w:tcW w:type="dxa" w:w="2160"/>
+            <w:tcW w:type="dxa" w:w="1872"/>
             <w:vAlign w:val="center"/>
             <w:shd w:fill="1F4E78"/>
             <w:tcMar>
@@ -9933,7 +9643,7 @@
         </w:trPr>
         <w:tc>
           <w:tcPr>
-            <w:tcW w:type="dxa" w:w="1440"/>
+            <w:tcW w:type="dxa" w:w="2592"/>
             <w:vAlign w:val="center"/>
             <w:shd w:fill="FFFFFF"/>
             <w:tcMar>
@@ -9955,13 +9665,13 @@
                 <w:color w:val="000000"/>
                 <w:sz w:val="20"/>
               </w:rPr>
-              <w:t>unrate</w:t>
-            </w:r>
-          </w:p>
-        </w:tc>
-        <w:tc>
-          <w:tcPr>
-            <w:tcW w:type="dxa" w:w="2160"/>
+              <w:t>FLBR_B.IUSA</w:t>
+            </w:r>
+          </w:p>
+        </w:tc>
+        <w:tc>
+          <w:tcPr>
+            <w:tcW w:type="dxa" w:w="1872"/>
             <w:vAlign w:val="center"/>
             <w:shd w:fill="FFFFFF"/>
             <w:tcMar>
@@ -9989,7 +9699,7 @@
         </w:tc>
         <w:tc>
           <w:tcPr>
-            <w:tcW w:type="dxa" w:w="2160"/>
+            <w:tcW w:type="dxa" w:w="1872"/>
             <w:vAlign w:val="center"/>
             <w:shd w:fill="FFFFFF"/>
             <w:tcMar>
@@ -10017,7 +9727,7 @@
         </w:tc>
         <w:tc>
           <w:tcPr>
-            <w:tcW w:type="dxa" w:w="2160"/>
+            <w:tcW w:type="dxa" w:w="1872"/>
             <w:vAlign w:val="center"/>
             <w:shd w:fill="FFFFFF"/>
             <w:tcMar>
@@ -10045,7 +9755,7 @@
         </w:tc>
         <w:tc>
           <w:tcPr>
-            <w:tcW w:type="dxa" w:w="2160"/>
+            <w:tcW w:type="dxa" w:w="1872"/>
             <w:vAlign w:val="center"/>
             <w:shd w:fill="FFFFFF"/>
             <w:tcMar>
@@ -10078,7 +9788,7 @@
         </w:trPr>
         <w:tc>
           <w:tcPr>
-            <w:tcW w:type="dxa" w:w="1440"/>
+            <w:tcW w:type="dxa" w:w="2592"/>
             <w:vAlign w:val="center"/>
             <w:shd w:fill="F2F6FA"/>
             <w:tcMar>
@@ -10100,13 +9810,13 @@
                 <w:color w:val="000000"/>
                 <w:sz w:val="20"/>
               </w:rPr>
-              <w:t>gap</w:t>
-            </w:r>
-          </w:p>
-        </w:tc>
-        <w:tc>
-          <w:tcPr>
-            <w:tcW w:type="dxa" w:w="2160"/>
+              <w:t>FGAP_B.IUSA</w:t>
+            </w:r>
+          </w:p>
+        </w:tc>
+        <w:tc>
+          <w:tcPr>
+            <w:tcW w:type="dxa" w:w="1872"/>
             <w:vAlign w:val="center"/>
             <w:shd w:fill="F2F6FA"/>
             <w:tcMar>
@@ -10134,7 +9844,7 @@
         </w:tc>
         <w:tc>
           <w:tcPr>
-            <w:tcW w:type="dxa" w:w="2160"/>
+            <w:tcW w:type="dxa" w:w="1872"/>
             <w:vAlign w:val="center"/>
             <w:shd w:fill="F2F6FA"/>
             <w:tcMar>
@@ -10162,7 +9872,7 @@
         </w:tc>
         <w:tc>
           <w:tcPr>
-            <w:tcW w:type="dxa" w:w="2160"/>
+            <w:tcW w:type="dxa" w:w="1872"/>
             <w:vAlign w:val="center"/>
             <w:shd w:fill="F2F6FA"/>
             <w:tcMar>
@@ -10190,7 +9900,7 @@
         </w:tc>
         <w:tc>
           <w:tcPr>
-            <w:tcW w:type="dxa" w:w="2160"/>
+            <w:tcW w:type="dxa" w:w="1872"/>
             <w:vAlign w:val="center"/>
             <w:shd w:fill="F2F6FA"/>
             <w:tcMar>
@@ -10223,7 +9933,7 @@
         </w:trPr>
         <w:tc>
           <w:tcPr>
-            <w:tcW w:type="dxa" w:w="1440"/>
+            <w:tcW w:type="dxa" w:w="2592"/>
             <w:vAlign w:val="center"/>
             <w:shd w:fill="FFFFFF"/>
             <w:tcMar>
@@ -10245,13 +9955,13 @@
                 <w:color w:val="000000"/>
                 <w:sz w:val="20"/>
               </w:rPr>
-              <w:t>gdp</w:t>
-            </w:r>
-          </w:p>
-        </w:tc>
-        <w:tc>
-          <w:tcPr>
-            <w:tcW w:type="dxa" w:w="2160"/>
+              <w:t>FGDP$_B.IUSA</w:t>
+            </w:r>
+          </w:p>
+        </w:tc>
+        <w:tc>
+          <w:tcPr>
+            <w:tcW w:type="dxa" w:w="1872"/>
             <w:vAlign w:val="center"/>
             <w:shd w:fill="FFFFFF"/>
             <w:tcMar>
@@ -10279,7 +9989,7 @@
         </w:tc>
         <w:tc>
           <w:tcPr>
-            <w:tcW w:type="dxa" w:w="2160"/>
+            <w:tcW w:type="dxa" w:w="1872"/>
             <w:vAlign w:val="center"/>
             <w:shd w:fill="FFFFFF"/>
             <w:tcMar>
@@ -10307,7 +10017,7 @@
         </w:tc>
         <w:tc>
           <w:tcPr>
-            <w:tcW w:type="dxa" w:w="2160"/>
+            <w:tcW w:type="dxa" w:w="1872"/>
             <w:vAlign w:val="center"/>
             <w:shd w:fill="FFFFFF"/>
             <w:tcMar>
@@ -10335,7 +10045,7 @@
         </w:tc>
         <w:tc>
           <w:tcPr>
-            <w:tcW w:type="dxa" w:w="2160"/>
+            <w:tcW w:type="dxa" w:w="1872"/>
             <w:vAlign w:val="center"/>
             <w:shd w:fill="FFFFFF"/>
             <w:tcMar>
@@ -10372,7 +10082,7 @@
         <w:rPr>
           <w:color w:val="000000"/>
         </w:rPr>
-        <w:t>Unrate has the lowest one-step RMSE, 0.02783, versus 0.02906 for gap and 0.02878 for GDP. Its recursive RMSE is 0.03728, versus 0.03643 and 0.03501. A persistence benchmark gives 0.03001 one-step and 0.03962 recursive RMSE. The nine-quarter window has been reviewed during model development and is not a new untouched confirmation sample.</w:t>
+        <w:t>FLBR_B.IUSA has the lowest one-step RMSE: 0.02783, versus 0.02906 for FGAP_B.IUSA and 0.02878 for FGDP$_B.IUSA. Its recursive RMSE is 0.03728, versus 0.03643 and 0.03501, respectively. A persistence benchmark gives 0.03001 one-step and 0.03962 recursive RMSE. This nine-quarter window has been reviewed during model development; it is not an untouched confirmation sample.</w:t>
       </w:r>
     </w:p>
     <w:p>
@@ -10384,7 +10094,7 @@
         <w:rPr>
           <w:color w:val="000000"/>
         </w:rPr>
-        <w:t>Figure 2  Final unrate model validation forecasts</w:t>
+        <w:t>Figure 2  Final FLBR_B.IUSA model validation forecasts</w:t>
       </w:r>
     </w:p>
     <w:p>
@@ -10397,7 +10107,7 @@
         <w:drawing>
           <wp:inline xmlns:a="http://schemas.openxmlformats.org/drawingml/2006/main" xmlns:pic="http://schemas.openxmlformats.org/drawingml/2006/picture">
             <wp:extent cx="6309360" cy="2125466"/>
-            <wp:docPr id="2" name="Picture 2" descr="Final unrate model validation forecasts"/>
+            <wp:docPr id="2" name="Picture 2" descr="Final FLBR_B.IUSA model validation forecasts"/>
             <wp:cNvGraphicFramePr>
               <a:graphicFrameLocks noChangeAspect="1"/>
             </wp:cNvGraphicFramePr>
@@ -10437,7 +10147,7 @@
         <w:rPr>
           <w:color w:val="000000"/>
         </w:rPr>
-        <w:t>Table 13  Quarterly validation forecasts for the final unrate model</w:t>
+        <w:t>Table 13  Quarterly validation forecasts for the final FLBR_B.IUSA model</w:t>
       </w:r>
     </w:p>
     <w:tbl>
@@ -11654,7 +11364,7 @@
         <w:rPr>
           <w:color w:val="000000"/>
         </w:rPr>
-        <w:t>After comparing the development models, we refit the fixed unrate specification through 2025Q4. This uses all 58 lag-eligible historical observations. We do not rerun selection on these additional quarters. The resulting coefficients are used for the forward S1 and S4 forecasts, not for the historical validation scores.</w:t>
+        <w:t>After the development-model comparison, we refit the fixed FLBR_B.IUSA specification through 2025Q4. This uses all 58 lag-eligible observations. We do not rerun selection on these additional quarters. These coefficients are used for the forward S1 and S4 forecasts, not for historical validation scores.</w:t>
       </w:r>
     </w:p>
     <w:p>
@@ -11666,7 +11376,7 @@
         <w:rPr>
           <w:color w:val="000000"/>
         </w:rPr>
-        <w:t>Table 14  Unrate model refitted through 2025Q4</w:t>
+        <w:t>Table 14  FLBR_B.IUSA model refitted through 2025Q4</w:t>
       </w:r>
     </w:p>
     <w:tbl>
@@ -12299,7 +12009,7 @@
                 <w:color w:val="000000"/>
                 <w:sz w:val="20"/>
               </w:rPr>
-              <w:t>Δunrate lag 1</w:t>
+              <w:t>ΔFLBR_B.IUSA lag 1</w:t>
             </w:r>
           </w:p>
         </w:tc>
@@ -13505,7 +13215,7 @@
         <w:rPr>
           <w:color w:val="000000"/>
         </w:rPr>
-        <w:t>S1 is the original Baseline unemployment path. S4 is the separate supplied unemployment path. Both are conditional inputs, not estimated by this model. Forecasts begin from actual 2025Q4 EF of 0.548, use the full-history coefficients, set D = 1 and feed each forecast into the next quarter. The macro paths are not merged or relabeled.</w:t>
+        <w:t>S1 is the original Baseline path for FLBR_B.IUSA. S4 is the separate supplied path for the same unemployment variable. Both are conditional inputs, not estimated here. Forecasts start from actual 2025Q4 EF of 0.548, use the full-history coefficients, set D = 1 and feed each forecast into the next quarter. The paths are not merged or relabeled.</w:t>
       </w:r>
     </w:p>
     <w:p>
@@ -13598,7 +13308,7 @@
                 <w:color w:val="FFFFFF"/>
                 <w:sz w:val="20"/>
               </w:rPr>
-              <w:t>S1 unrate %</w:t>
+              <w:t>S1 FLBR_B.IUSA %</w:t>
             </w:r>
           </w:p>
         </w:tc>
@@ -13626,7 +13336,7 @@
                 <w:color w:val="FFFFFF"/>
                 <w:sz w:val="20"/>
               </w:rPr>
-              <w:t>S4 unrate %</w:t>
+              <w:t>S4 FLBR_B.IUSA %</w:t>
             </w:r>
           </w:p>
         </w:tc>
@@ -15003,7 +14713,7 @@
         <w:rPr>
           <w:color w:val="000000"/>
         </w:rPr>
-        <w:t>Figure 3  S1 and S4 unemployment paths and nine quarter EF forecasts</w:t>
+        <w:t>Figure 3  S1 and S4 FLBR_B.IUSA paths and nine quarter EF forecasts</w:t>
       </w:r>
     </w:p>
     <w:p>
@@ -15069,7 +14779,7 @@
         <w:rPr>
           <w:color w:val="000000"/>
         </w:rPr>
-        <w:t>10 Unemployment sensitivity</w:t>
+        <w:t>10 FLBR_B.IUSA sensitivity</w:t>
       </w:r>
     </w:p>
     <w:p>
@@ -15080,7 +14790,7 @@
         <w:rPr>
           <w:color w:val="000000"/>
         </w:rPr>
-        <w:t>We shift every future unemployment level up or down by one percentage point and leave historical levels unchanged. This is a parallel level shift, not a one percent relative change and not an extra one percentage point increase each quarter. We recompute quarterly differences and their lags before forecasting. The same test is applied separately to S1 and S4.</w:t>
+        <w:t>We shift every future FLBR_B.IUSA level up or down by one percentage point and leave historical levels unchanged. This is a parallel unemployment-level shift, not a one percent relative change or an extra one percentage point increase each quarter. We recompute quarterly differences and their lags before forecasting. The test is applied separately to S1 and S4.</w:t>
       </w:r>
     </w:p>
     <w:p>
@@ -15092,7 +14802,7 @@
         <w:rPr>
           <w:color w:val="000000"/>
         </w:rPr>
-        <w:t>Table 18  S1 unemployment level sensitivity</w:t>
+        <w:t>Table 18  S1 FLBR_B.IUSA level sensitivity</w:t>
       </w:r>
     </w:p>
     <w:tbl>
@@ -16297,7 +16007,7 @@
         <w:rPr>
           <w:color w:val="000000"/>
         </w:rPr>
-        <w:t>Figure 4  EF response to a parallel shift in the S1 unemployment path</w:t>
+        <w:t>Figure 4  EF response to a parallel shift in the S1 FLBR_B.IUSA path</w:t>
       </w:r>
     </w:p>
     <w:p>
@@ -16455,7 +16165,7 @@
         <w:rPr>
           <w:color w:val="000000"/>
         </w:rPr>
-        <w:t>All entries below are first-round conditional p values from the same 49 observations. The trend screen conditions on constant, D, t and EF lag 1. The no-trend screen omits t. L denotes a quarterly log change and Δ a quarterly level difference; all transformed inputs are lagged one quarter. Provider identifiers are retained where no descriptive label is supplied.</w:t>
+        <w:t>All entries are first-round conditional p values from the same 49 observations. The trend screen conditions on a constant, D, t and EF lag 1. The no-trend screen omits t. L denotes a quarterly log change and Δ a quarterly level difference; both are lagged one quarter. All candidate names use the source-column codes. Appendix B defines each variable.</w:t>
       </w:r>
     </w:p>
     <w:p>
@@ -16636,7 +16346,7 @@
                 <w:color w:val="000000"/>
                 <w:sz w:val="20"/>
               </w:rPr>
-              <w:t>earnings</w:t>
+              <w:t>FAHEFI_B.IUSA</w:t>
             </w:r>
           </w:p>
         </w:tc>
@@ -16753,7 +16463,7 @@
                 <w:color w:val="000000"/>
                 <w:sz w:val="20"/>
               </w:rPr>
-              <w:t>ulc</w:t>
+              <w:t>FPCNBULC_B.IUSA</w:t>
             </w:r>
           </w:p>
         </w:tc>
@@ -16870,7 +16580,7 @@
                 <w:color w:val="000000"/>
                 <w:sz w:val="20"/>
               </w:rPr>
-              <w:t>eci</w:t>
+              <w:t>FECICPQ_B.IUSA</w:t>
             </w:r>
           </w:p>
         </w:tc>
@@ -16987,7 +16697,7 @@
                 <w:color w:val="000000"/>
                 <w:sz w:val="20"/>
               </w:rPr>
-              <w:t>fed</w:t>
+              <w:t>FRFED_B.IUSA</w:t>
             </w:r>
           </w:p>
         </w:tc>
@@ -17104,7 +16814,7 @@
                 <w:color w:val="000000"/>
                 <w:sz w:val="20"/>
               </w:rPr>
-              <w:t>t2y</w:t>
+              <w:t>FRGT2Y_B.IUSA</w:t>
             </w:r>
           </w:p>
         </w:tc>
@@ -17221,7 +16931,7 @@
                 <w:color w:val="000000"/>
                 <w:sz w:val="20"/>
               </w:rPr>
-              <w:t>t10y</w:t>
+              <w:t>FRGT10Y_B.IUSA</w:t>
             </w:r>
           </w:p>
         </w:tc>
@@ -17338,7 +17048,7 @@
                 <w:color w:val="000000"/>
                 <w:sz w:val="20"/>
               </w:rPr>
-              <w:t>unrate (unemp)</w:t>
+              <w:t>FLBR_B.IUSA</w:t>
             </w:r>
           </w:p>
         </w:tc>
@@ -17455,7 +17165,7 @@
                 <w:color w:val="000000"/>
                 <w:sz w:val="20"/>
               </w:rPr>
-              <w:t>confidence</w:t>
+              <w:t>FCBC_B.IUSA</w:t>
             </w:r>
           </w:p>
         </w:tc>
@@ -17572,7 +17282,7 @@
                 <w:color w:val="000000"/>
                 <w:sz w:val="20"/>
               </w:rPr>
-              <w:t>optimism</w:t>
+              <w:t>FSBINQ_B.IUSA</w:t>
             </w:r>
           </w:p>
         </w:tc>
@@ -17689,7 +17399,7 @@
                 <w:color w:val="000000"/>
                 <w:sz w:val="20"/>
               </w:rPr>
-              <w:t>gdp</w:t>
+              <w:t>FGDP$_B.IUSA</w:t>
             </w:r>
           </w:p>
         </w:tc>
@@ -17806,7 +17516,7 @@
                 <w:color w:val="000000"/>
                 <w:sz w:val="20"/>
               </w:rPr>
-              <w:t>gap</w:t>
+              <w:t>FGAP_B.IUSA</w:t>
             </w:r>
           </w:p>
         </w:tc>
@@ -17923,7 +17633,7 @@
                 <w:color w:val="000000"/>
                 <w:sz w:val="20"/>
               </w:rPr>
-              <w:t>assets</w:t>
+              <w:t>FBBACBQ_B.IUSA</w:t>
             </w:r>
           </w:p>
         </w:tc>
@@ -18040,7 +17750,7 @@
                 <w:color w:val="000000"/>
                 <w:sz w:val="20"/>
               </w:rPr>
-              <w:t>loans</w:t>
+              <w:t>FBBABLLCBQ_B.IUSA</w:t>
             </w:r>
           </w:p>
         </w:tc>
@@ -18157,7 +17867,7 @@
                 <w:color w:val="000000"/>
                 <w:sz w:val="20"/>
               </w:rPr>
-              <w:t>vix</w:t>
+              <w:t>FCBOEVIXQ_B.IUSA</w:t>
             </w:r>
           </w:p>
         </w:tc>
@@ -18274,7 +17984,7 @@
                 <w:color w:val="000000"/>
                 <w:sz w:val="20"/>
               </w:rPr>
-              <w:t>hy</w:t>
+              <w:t>FIRHYBOASQ_B.IUSA</w:t>
             </w:r>
           </w:p>
         </w:tc>
@@ -19192,7 +18902,7 @@
         <w:rPr>
           <w:color w:val="000000"/>
         </w:rPr>
-        <w:t>The final choice of unrate is not presented as a strict no-trend forward-selection victory. Gap has the lowest entry p value in that search. The final decision combines close fit, validation performance and the interpretability of the unemployment driver, as documented in Sections 5 and 7.</w:t>
+        <w:t>The main sequence selects FLBR_B.IUSA with trend, assesses t, and then removes t and reestimates. A separate no-trend search selects FGAP_B.IUSA (entry p = 0.0267) and stops in round 2 (FECICPQ_B.IUSA p = 0.0788). This is an alternative-driver check, not the initial selection path. The final choice combines close fit, validation and economic interpretation (Sections 5 and 7).</w:t>
       </w:r>
     </w:p>
     <w:p>
@@ -19206,7 +18916,19 @@
         <w:rPr>
           <w:color w:val="000000"/>
         </w:rPr>
-        <w:t>Appendix B Smoothed EF and method references</w:t>
+        <w:t>Appendix B Macro variable definitions</w:t>
+      </w:r>
+    </w:p>
+    <w:p>
+      <w:pPr>
+        <w:widowControl/>
+        <w:spacing w:before="140"/>
+      </w:pPr>
+      <w:r>
+        <w:rPr>
+          <w:color w:val="000000"/>
+        </w:rPr>
+        <w:t>Codes, descriptions and units below follow the source macro data dictionary. The codes match all 22 source CSV columns. The underlying 60-quarter values and the EF experiment transformations are unchanged.</w:t>
       </w:r>
     </w:p>
     <w:p>
@@ -19218,7 +18940,2113 @@
         <w:rPr>
           <w:color w:val="000000"/>
         </w:rPr>
-        <w:t>Table 20  Complete EF series used in the analysis</w:t>
+        <w:t>Table 20  Source macro codes, descriptions and units</w:t>
+      </w:r>
+    </w:p>
+    <w:tbl>
+      <w:tblPr>
+        <w:tblW w:type="auto" w:w="0"/>
+        <w:tblLayout w:type="fixed"/>
+        <w:tblLook w:firstColumn="1" w:firstRow="1" w:lastColumn="0" w:lastRow="0" w:noHBand="0" w:noVBand="1" w:val="04A0"/>
+        <w:tblBorders>
+          <w:top w:val="single" w:sz="5" w:color="D9D9D9"/>
+          <w:left w:val="single" w:sz="5" w:color="D9D9D9"/>
+          <w:bottom w:val="single" w:sz="5" w:color="D9D9D9"/>
+          <w:right w:val="single" w:sz="5" w:color="D9D9D9"/>
+          <w:insideH w:val="single" w:sz="5" w:color="D9D9D9"/>
+          <w:insideV w:val="single" w:sz="5" w:color="D9D9D9"/>
+        </w:tblBorders>
+      </w:tblPr>
+      <w:tblGrid>
+        <w:gridCol w:w="2664"/>
+        <w:gridCol w:w="4824"/>
+        <w:gridCol w:w="2592"/>
+      </w:tblGrid>
+      <w:tr>
+        <w:trPr>
+          <w:cantSplit/>
+          <w:tblHeader/>
+        </w:trPr>
+        <w:tc>
+          <w:tcPr>
+            <w:tcW w:type="dxa" w:w="2664"/>
+            <w:vAlign w:val="center"/>
+            <w:shd w:fill="1F4E78"/>
+            <w:tcMar>
+              <w:top w:w="65" w:type="dxa"/>
+              <w:bottom w:w="65" w:type="dxa"/>
+              <w:start w:w="105" w:type="dxa"/>
+              <w:end w:w="105" w:type="dxa"/>
+            </w:tcMar>
+          </w:tcPr>
+          <w:p>
+            <w:pPr>
+              <w:spacing w:after="0" w:line="252" w:lineRule="auto"/>
+              <w:jc w:val="left"/>
+            </w:pPr>
+            <w:r>
+              <w:rPr>
+                <w:rFonts w:ascii="Times New Roman" w:hAnsi="Times New Roman"/>
+                <w:b/>
+                <w:color w:val="FFFFFF"/>
+                <w:sz w:val="20"/>
+              </w:rPr>
+              <w:t>Source code</w:t>
+            </w:r>
+          </w:p>
+        </w:tc>
+        <w:tc>
+          <w:tcPr>
+            <w:tcW w:type="dxa" w:w="4824"/>
+            <w:vAlign w:val="center"/>
+            <w:shd w:fill="1F4E78"/>
+            <w:tcMar>
+              <w:top w:w="65" w:type="dxa"/>
+              <w:bottom w:w="65" w:type="dxa"/>
+              <w:start w:w="105" w:type="dxa"/>
+              <w:end w:w="105" w:type="dxa"/>
+            </w:tcMar>
+          </w:tcPr>
+          <w:p>
+            <w:pPr>
+              <w:spacing w:after="0" w:line="252" w:lineRule="auto"/>
+              <w:jc w:val="left"/>
+            </w:pPr>
+            <w:r>
+              <w:rPr>
+                <w:rFonts w:ascii="Times New Roman" w:hAnsi="Times New Roman"/>
+                <w:b/>
+                <w:color w:val="FFFFFF"/>
+                <w:sz w:val="20"/>
+              </w:rPr>
+              <w:t>Variable description</w:t>
+            </w:r>
+          </w:p>
+        </w:tc>
+        <w:tc>
+          <w:tcPr>
+            <w:tcW w:type="dxa" w:w="2592"/>
+            <w:vAlign w:val="center"/>
+            <w:shd w:fill="1F4E78"/>
+            <w:tcMar>
+              <w:top w:w="65" w:type="dxa"/>
+              <w:bottom w:w="65" w:type="dxa"/>
+              <w:start w:w="105" w:type="dxa"/>
+              <w:end w:w="105" w:type="dxa"/>
+            </w:tcMar>
+          </w:tcPr>
+          <w:p>
+            <w:pPr>
+              <w:spacing w:after="0" w:line="252" w:lineRule="auto"/>
+              <w:jc w:val="left"/>
+            </w:pPr>
+            <w:r>
+              <w:rPr>
+                <w:rFonts w:ascii="Times New Roman" w:hAnsi="Times New Roman"/>
+                <w:b/>
+                <w:color w:val="FFFFFF"/>
+                <w:sz w:val="20"/>
+              </w:rPr>
+              <w:t>Unit / adjustment</w:t>
+            </w:r>
+          </w:p>
+        </w:tc>
+      </w:tr>
+      <w:tr>
+        <w:trPr>
+          <w:cantSplit/>
+        </w:trPr>
+        <w:tc>
+          <w:tcPr>
+            <w:tcW w:type="dxa" w:w="2664"/>
+            <w:vAlign w:val="center"/>
+            <w:shd w:fill="FFFFFF"/>
+            <w:tcMar>
+              <w:top w:w="65" w:type="dxa"/>
+              <w:bottom w:w="65" w:type="dxa"/>
+              <w:start w:w="105" w:type="dxa"/>
+              <w:end w:w="105" w:type="dxa"/>
+            </w:tcMar>
+          </w:tcPr>
+          <w:p>
+            <w:pPr>
+              <w:spacing w:after="0" w:line="252" w:lineRule="auto"/>
+              <w:jc w:val="left"/>
+            </w:pPr>
+            <w:r>
+              <w:rPr>
+                <w:rFonts w:ascii="Times New Roman" w:hAnsi="Times New Roman"/>
+                <w:b w:val="0"/>
+                <w:color w:val="000000"/>
+                <w:sz w:val="20"/>
+              </w:rPr>
+              <w:t>FAHEFI_B.IUSA</w:t>
+            </w:r>
+          </w:p>
+        </w:tc>
+        <w:tc>
+          <w:tcPr>
+            <w:tcW w:type="dxa" w:w="4824"/>
+            <w:vAlign w:val="center"/>
+            <w:shd w:fill="FFFFFF"/>
+            <w:tcMar>
+              <w:top w:w="65" w:type="dxa"/>
+              <w:bottom w:w="65" w:type="dxa"/>
+              <w:start w:w="105" w:type="dxa"/>
+              <w:end w:w="105" w:type="dxa"/>
+            </w:tcMar>
+          </w:tcPr>
+          <w:p>
+            <w:pPr>
+              <w:spacing w:after="0" w:line="252" w:lineRule="auto"/>
+              <w:jc w:val="left"/>
+            </w:pPr>
+            <w:r>
+              <w:rPr>
+                <w:rFonts w:ascii="Times New Roman" w:hAnsi="Times New Roman"/>
+                <w:b w:val="0"/>
+                <w:color w:val="000000"/>
+                <w:sz w:val="20"/>
+              </w:rPr>
+              <w:t>Financial activities average hourly earnings</w:t>
+            </w:r>
+          </w:p>
+        </w:tc>
+        <w:tc>
+          <w:tcPr>
+            <w:tcW w:type="dxa" w:w="2592"/>
+            <w:vAlign w:val="center"/>
+            <w:shd w:fill="FFFFFF"/>
+            <w:tcMar>
+              <w:top w:w="65" w:type="dxa"/>
+              <w:bottom w:w="65" w:type="dxa"/>
+              <w:start w:w="105" w:type="dxa"/>
+              <w:end w:w="105" w:type="dxa"/>
+            </w:tcMar>
+          </w:tcPr>
+          <w:p>
+            <w:pPr>
+              <w:spacing w:after="0" w:line="252" w:lineRule="auto"/>
+              <w:jc w:val="left"/>
+            </w:pPr>
+            <w:r>
+              <w:rPr>
+                <w:rFonts w:ascii="Times New Roman" w:hAnsi="Times New Roman"/>
+                <w:b w:val="0"/>
+                <w:color w:val="000000"/>
+                <w:sz w:val="20"/>
+              </w:rPr>
+              <w:t>USD per hour; SA</w:t>
+            </w:r>
+          </w:p>
+        </w:tc>
+      </w:tr>
+      <w:tr>
+        <w:trPr>
+          <w:cantSplit/>
+        </w:trPr>
+        <w:tc>
+          <w:tcPr>
+            <w:tcW w:type="dxa" w:w="2664"/>
+            <w:vAlign w:val="center"/>
+            <w:shd w:fill="F2F6FA"/>
+            <w:tcMar>
+              <w:top w:w="65" w:type="dxa"/>
+              <w:bottom w:w="65" w:type="dxa"/>
+              <w:start w:w="105" w:type="dxa"/>
+              <w:end w:w="105" w:type="dxa"/>
+            </w:tcMar>
+          </w:tcPr>
+          <w:p>
+            <w:pPr>
+              <w:spacing w:after="0" w:line="252" w:lineRule="auto"/>
+              <w:jc w:val="left"/>
+            </w:pPr>
+            <w:r>
+              <w:rPr>
+                <w:rFonts w:ascii="Times New Roman" w:hAnsi="Times New Roman"/>
+                <w:b w:val="0"/>
+                <w:color w:val="000000"/>
+                <w:sz w:val="20"/>
+              </w:rPr>
+              <w:t>FPCNBULC_B.IUSA</w:t>
+            </w:r>
+          </w:p>
+        </w:tc>
+        <w:tc>
+          <w:tcPr>
+            <w:tcW w:type="dxa" w:w="4824"/>
+            <w:vAlign w:val="center"/>
+            <w:shd w:fill="F2F6FA"/>
+            <w:tcMar>
+              <w:top w:w="65" w:type="dxa"/>
+              <w:bottom w:w="65" w:type="dxa"/>
+              <w:start w:w="105" w:type="dxa"/>
+              <w:end w:w="105" w:type="dxa"/>
+            </w:tcMar>
+          </w:tcPr>
+          <w:p>
+            <w:pPr>
+              <w:spacing w:after="0" w:line="252" w:lineRule="auto"/>
+              <w:jc w:val="left"/>
+            </w:pPr>
+            <w:r>
+              <w:rPr>
+                <w:rFonts w:ascii="Times New Roman" w:hAnsi="Times New Roman"/>
+                <w:b w:val="0"/>
+                <w:color w:val="000000"/>
+                <w:sz w:val="20"/>
+              </w:rPr>
+              <w:t>Nonfarm business unit labor costs</w:t>
+            </w:r>
+          </w:p>
+        </w:tc>
+        <w:tc>
+          <w:tcPr>
+            <w:tcW w:type="dxa" w:w="2592"/>
+            <w:vAlign w:val="center"/>
+            <w:shd w:fill="F2F6FA"/>
+            <w:tcMar>
+              <w:top w:w="65" w:type="dxa"/>
+              <w:bottom w:w="65" w:type="dxa"/>
+              <w:start w:w="105" w:type="dxa"/>
+              <w:end w:w="105" w:type="dxa"/>
+            </w:tcMar>
+          </w:tcPr>
+          <w:p>
+            <w:pPr>
+              <w:spacing w:after="0" w:line="252" w:lineRule="auto"/>
+              <w:jc w:val="left"/>
+            </w:pPr>
+            <w:r>
+              <w:rPr>
+                <w:rFonts w:ascii="Times New Roman" w:hAnsi="Times New Roman"/>
+                <w:b w:val="0"/>
+                <w:color w:val="000000"/>
+                <w:sz w:val="20"/>
+              </w:rPr>
+              <w:t>Index 2017=100; SA</w:t>
+            </w:r>
+          </w:p>
+        </w:tc>
+      </w:tr>
+      <w:tr>
+        <w:trPr>
+          <w:cantSplit/>
+        </w:trPr>
+        <w:tc>
+          <w:tcPr>
+            <w:tcW w:type="dxa" w:w="2664"/>
+            <w:vAlign w:val="center"/>
+            <w:shd w:fill="FFFFFF"/>
+            <w:tcMar>
+              <w:top w:w="65" w:type="dxa"/>
+              <w:bottom w:w="65" w:type="dxa"/>
+              <w:start w:w="105" w:type="dxa"/>
+              <w:end w:w="105" w:type="dxa"/>
+            </w:tcMar>
+          </w:tcPr>
+          <w:p>
+            <w:pPr>
+              <w:spacing w:after="0" w:line="252" w:lineRule="auto"/>
+              <w:jc w:val="left"/>
+            </w:pPr>
+            <w:r>
+              <w:rPr>
+                <w:rFonts w:ascii="Times New Roman" w:hAnsi="Times New Roman"/>
+                <w:b w:val="0"/>
+                <w:color w:val="000000"/>
+                <w:sz w:val="20"/>
+              </w:rPr>
+              <w:t>FECICPQ_B.IUSA</w:t>
+            </w:r>
+          </w:p>
+        </w:tc>
+        <w:tc>
+          <w:tcPr>
+            <w:tcW w:type="dxa" w:w="4824"/>
+            <w:vAlign w:val="center"/>
+            <w:shd w:fill="FFFFFF"/>
+            <w:tcMar>
+              <w:top w:w="65" w:type="dxa"/>
+              <w:bottom w:w="65" w:type="dxa"/>
+              <w:start w:w="105" w:type="dxa"/>
+              <w:end w:w="105" w:type="dxa"/>
+            </w:tcMar>
+          </w:tcPr>
+          <w:p>
+            <w:pPr>
+              <w:spacing w:after="0" w:line="252" w:lineRule="auto"/>
+              <w:jc w:val="left"/>
+            </w:pPr>
+            <w:r>
+              <w:rPr>
+                <w:rFonts w:ascii="Times New Roman" w:hAnsi="Times New Roman"/>
+                <w:b w:val="0"/>
+                <w:color w:val="000000"/>
+                <w:sz w:val="20"/>
+              </w:rPr>
+              <w:t>Private industry total compensation ECI</w:t>
+            </w:r>
+          </w:p>
+        </w:tc>
+        <w:tc>
+          <w:tcPr>
+            <w:tcW w:type="dxa" w:w="2592"/>
+            <w:vAlign w:val="center"/>
+            <w:shd w:fill="FFFFFF"/>
+            <w:tcMar>
+              <w:top w:w="65" w:type="dxa"/>
+              <w:bottom w:w="65" w:type="dxa"/>
+              <w:start w:w="105" w:type="dxa"/>
+              <w:end w:w="105" w:type="dxa"/>
+            </w:tcMar>
+          </w:tcPr>
+          <w:p>
+            <w:pPr>
+              <w:spacing w:after="0" w:line="252" w:lineRule="auto"/>
+              <w:jc w:val="left"/>
+            </w:pPr>
+            <w:r>
+              <w:rPr>
+                <w:rFonts w:ascii="Times New Roman" w:hAnsi="Times New Roman"/>
+                <w:b w:val="0"/>
+                <w:color w:val="000000"/>
+                <w:sz w:val="20"/>
+              </w:rPr>
+              <w:t>Index Dec 2005=100; SA</w:t>
+            </w:r>
+          </w:p>
+        </w:tc>
+      </w:tr>
+      <w:tr>
+        <w:trPr>
+          <w:cantSplit/>
+        </w:trPr>
+        <w:tc>
+          <w:tcPr>
+            <w:tcW w:type="dxa" w:w="2664"/>
+            <w:vAlign w:val="center"/>
+            <w:shd w:fill="F2F6FA"/>
+            <w:tcMar>
+              <w:top w:w="65" w:type="dxa"/>
+              <w:bottom w:w="65" w:type="dxa"/>
+              <w:start w:w="105" w:type="dxa"/>
+              <w:end w:w="105" w:type="dxa"/>
+            </w:tcMar>
+          </w:tcPr>
+          <w:p>
+            <w:pPr>
+              <w:spacing w:after="0" w:line="252" w:lineRule="auto"/>
+              <w:jc w:val="left"/>
+            </w:pPr>
+            <w:r>
+              <w:rPr>
+                <w:rFonts w:ascii="Times New Roman" w:hAnsi="Times New Roman"/>
+                <w:b w:val="0"/>
+                <w:color w:val="000000"/>
+                <w:sz w:val="20"/>
+              </w:rPr>
+              <w:t>FRFED_B.IUSA</w:t>
+            </w:r>
+          </w:p>
+        </w:tc>
+        <w:tc>
+          <w:tcPr>
+            <w:tcW w:type="dxa" w:w="4824"/>
+            <w:vAlign w:val="center"/>
+            <w:shd w:fill="F2F6FA"/>
+            <w:tcMar>
+              <w:top w:w="65" w:type="dxa"/>
+              <w:bottom w:w="65" w:type="dxa"/>
+              <w:start w:w="105" w:type="dxa"/>
+              <w:end w:w="105" w:type="dxa"/>
+            </w:tcMar>
+          </w:tcPr>
+          <w:p>
+            <w:pPr>
+              <w:spacing w:after="0" w:line="252" w:lineRule="auto"/>
+              <w:jc w:val="left"/>
+            </w:pPr>
+            <w:r>
+              <w:rPr>
+                <w:rFonts w:ascii="Times New Roman" w:hAnsi="Times New Roman"/>
+                <w:b w:val="0"/>
+                <w:color w:val="000000"/>
+                <w:sz w:val="20"/>
+              </w:rPr>
+              <w:t>Federal funds rate</w:t>
+            </w:r>
+          </w:p>
+        </w:tc>
+        <w:tc>
+          <w:tcPr>
+            <w:tcW w:type="dxa" w:w="2592"/>
+            <w:vAlign w:val="center"/>
+            <w:shd w:fill="F2F6FA"/>
+            <w:tcMar>
+              <w:top w:w="65" w:type="dxa"/>
+              <w:bottom w:w="65" w:type="dxa"/>
+              <w:start w:w="105" w:type="dxa"/>
+              <w:end w:w="105" w:type="dxa"/>
+            </w:tcMar>
+          </w:tcPr>
+          <w:p>
+            <w:pPr>
+              <w:spacing w:after="0" w:line="252" w:lineRule="auto"/>
+              <w:jc w:val="left"/>
+            </w:pPr>
+            <w:r>
+              <w:rPr>
+                <w:rFonts w:ascii="Times New Roman" w:hAnsi="Times New Roman"/>
+                <w:b w:val="0"/>
+                <w:color w:val="000000"/>
+                <w:sz w:val="20"/>
+              </w:rPr>
+              <w:t>Percent per annum; NSA</w:t>
+            </w:r>
+          </w:p>
+        </w:tc>
+      </w:tr>
+      <w:tr>
+        <w:trPr>
+          <w:cantSplit/>
+        </w:trPr>
+        <w:tc>
+          <w:tcPr>
+            <w:tcW w:type="dxa" w:w="2664"/>
+            <w:vAlign w:val="center"/>
+            <w:shd w:fill="FFFFFF"/>
+            <w:tcMar>
+              <w:top w:w="65" w:type="dxa"/>
+              <w:bottom w:w="65" w:type="dxa"/>
+              <w:start w:w="105" w:type="dxa"/>
+              <w:end w:w="105" w:type="dxa"/>
+            </w:tcMar>
+          </w:tcPr>
+          <w:p>
+            <w:pPr>
+              <w:spacing w:after="0" w:line="252" w:lineRule="auto"/>
+              <w:jc w:val="left"/>
+            </w:pPr>
+            <w:r>
+              <w:rPr>
+                <w:rFonts w:ascii="Times New Roman" w:hAnsi="Times New Roman"/>
+                <w:b w:val="0"/>
+                <w:color w:val="000000"/>
+                <w:sz w:val="20"/>
+              </w:rPr>
+              <w:t>FRGT2Y_B.IUSA</w:t>
+            </w:r>
+          </w:p>
+        </w:tc>
+        <w:tc>
+          <w:tcPr>
+            <w:tcW w:type="dxa" w:w="4824"/>
+            <w:vAlign w:val="center"/>
+            <w:shd w:fill="FFFFFF"/>
+            <w:tcMar>
+              <w:top w:w="65" w:type="dxa"/>
+              <w:bottom w:w="65" w:type="dxa"/>
+              <w:start w:w="105" w:type="dxa"/>
+              <w:end w:w="105" w:type="dxa"/>
+            </w:tcMar>
+          </w:tcPr>
+          <w:p>
+            <w:pPr>
+              <w:spacing w:after="0" w:line="252" w:lineRule="auto"/>
+              <w:jc w:val="left"/>
+            </w:pPr>
+            <w:r>
+              <w:rPr>
+                <w:rFonts w:ascii="Times New Roman" w:hAnsi="Times New Roman"/>
+                <w:b w:val="0"/>
+                <w:color w:val="000000"/>
+                <w:sz w:val="20"/>
+              </w:rPr>
+              <w:t>Two year Treasury constant maturity rate</w:t>
+            </w:r>
+          </w:p>
+        </w:tc>
+        <w:tc>
+          <w:tcPr>
+            <w:tcW w:type="dxa" w:w="2592"/>
+            <w:vAlign w:val="center"/>
+            <w:shd w:fill="FFFFFF"/>
+            <w:tcMar>
+              <w:top w:w="65" w:type="dxa"/>
+              <w:bottom w:w="65" w:type="dxa"/>
+              <w:start w:w="105" w:type="dxa"/>
+              <w:end w:w="105" w:type="dxa"/>
+            </w:tcMar>
+          </w:tcPr>
+          <w:p>
+            <w:pPr>
+              <w:spacing w:after="0" w:line="252" w:lineRule="auto"/>
+              <w:jc w:val="left"/>
+            </w:pPr>
+            <w:r>
+              <w:rPr>
+                <w:rFonts w:ascii="Times New Roman" w:hAnsi="Times New Roman"/>
+                <w:b w:val="0"/>
+                <w:color w:val="000000"/>
+                <w:sz w:val="20"/>
+              </w:rPr>
+              <w:t>Percent per annum; NSA</w:t>
+            </w:r>
+          </w:p>
+        </w:tc>
+      </w:tr>
+      <w:tr>
+        <w:trPr>
+          <w:cantSplit/>
+        </w:trPr>
+        <w:tc>
+          <w:tcPr>
+            <w:tcW w:type="dxa" w:w="2664"/>
+            <w:vAlign w:val="center"/>
+            <w:shd w:fill="F2F6FA"/>
+            <w:tcMar>
+              <w:top w:w="65" w:type="dxa"/>
+              <w:bottom w:w="65" w:type="dxa"/>
+              <w:start w:w="105" w:type="dxa"/>
+              <w:end w:w="105" w:type="dxa"/>
+            </w:tcMar>
+          </w:tcPr>
+          <w:p>
+            <w:pPr>
+              <w:spacing w:after="0" w:line="252" w:lineRule="auto"/>
+              <w:jc w:val="left"/>
+            </w:pPr>
+            <w:r>
+              <w:rPr>
+                <w:rFonts w:ascii="Times New Roman" w:hAnsi="Times New Roman"/>
+                <w:b w:val="0"/>
+                <w:color w:val="000000"/>
+                <w:sz w:val="20"/>
+              </w:rPr>
+              <w:t>FRGT10Y_B.IUSA</w:t>
+            </w:r>
+          </w:p>
+        </w:tc>
+        <w:tc>
+          <w:tcPr>
+            <w:tcW w:type="dxa" w:w="4824"/>
+            <w:vAlign w:val="center"/>
+            <w:shd w:fill="F2F6FA"/>
+            <w:tcMar>
+              <w:top w:w="65" w:type="dxa"/>
+              <w:bottom w:w="65" w:type="dxa"/>
+              <w:start w:w="105" w:type="dxa"/>
+              <w:end w:w="105" w:type="dxa"/>
+            </w:tcMar>
+          </w:tcPr>
+          <w:p>
+            <w:pPr>
+              <w:spacing w:after="0" w:line="252" w:lineRule="auto"/>
+              <w:jc w:val="left"/>
+            </w:pPr>
+            <w:r>
+              <w:rPr>
+                <w:rFonts w:ascii="Times New Roman" w:hAnsi="Times New Roman"/>
+                <w:b w:val="0"/>
+                <w:color w:val="000000"/>
+                <w:sz w:val="20"/>
+              </w:rPr>
+              <w:t>Ten year Treasury constant maturity rate</w:t>
+            </w:r>
+          </w:p>
+        </w:tc>
+        <w:tc>
+          <w:tcPr>
+            <w:tcW w:type="dxa" w:w="2592"/>
+            <w:vAlign w:val="center"/>
+            <w:shd w:fill="F2F6FA"/>
+            <w:tcMar>
+              <w:top w:w="65" w:type="dxa"/>
+              <w:bottom w:w="65" w:type="dxa"/>
+              <w:start w:w="105" w:type="dxa"/>
+              <w:end w:w="105" w:type="dxa"/>
+            </w:tcMar>
+          </w:tcPr>
+          <w:p>
+            <w:pPr>
+              <w:spacing w:after="0" w:line="252" w:lineRule="auto"/>
+              <w:jc w:val="left"/>
+            </w:pPr>
+            <w:r>
+              <w:rPr>
+                <w:rFonts w:ascii="Times New Roman" w:hAnsi="Times New Roman"/>
+                <w:b w:val="0"/>
+                <w:color w:val="000000"/>
+                <w:sz w:val="20"/>
+              </w:rPr>
+              <w:t>Percent per annum; NSA</w:t>
+            </w:r>
+          </w:p>
+        </w:tc>
+      </w:tr>
+      <w:tr>
+        <w:trPr>
+          <w:cantSplit/>
+        </w:trPr>
+        <w:tc>
+          <w:tcPr>
+            <w:tcW w:type="dxa" w:w="2664"/>
+            <w:vAlign w:val="center"/>
+            <w:shd w:fill="FFFFFF"/>
+            <w:tcMar>
+              <w:top w:w="65" w:type="dxa"/>
+              <w:bottom w:w="65" w:type="dxa"/>
+              <w:start w:w="105" w:type="dxa"/>
+              <w:end w:w="105" w:type="dxa"/>
+            </w:tcMar>
+          </w:tcPr>
+          <w:p>
+            <w:pPr>
+              <w:spacing w:after="0" w:line="252" w:lineRule="auto"/>
+              <w:jc w:val="left"/>
+            </w:pPr>
+            <w:r>
+              <w:rPr>
+                <w:rFonts w:ascii="Times New Roman" w:hAnsi="Times New Roman"/>
+                <w:b w:val="0"/>
+                <w:color w:val="000000"/>
+                <w:sz w:val="20"/>
+              </w:rPr>
+              <w:t>FLBR_B.IUSA</w:t>
+            </w:r>
+          </w:p>
+        </w:tc>
+        <w:tc>
+          <w:tcPr>
+            <w:tcW w:type="dxa" w:w="4824"/>
+            <w:vAlign w:val="center"/>
+            <w:shd w:fill="FFFFFF"/>
+            <w:tcMar>
+              <w:top w:w="65" w:type="dxa"/>
+              <w:bottom w:w="65" w:type="dxa"/>
+              <w:start w:w="105" w:type="dxa"/>
+              <w:end w:w="105" w:type="dxa"/>
+            </w:tcMar>
+          </w:tcPr>
+          <w:p>
+            <w:pPr>
+              <w:spacing w:after="0" w:line="252" w:lineRule="auto"/>
+              <w:jc w:val="left"/>
+            </w:pPr>
+            <w:r>
+              <w:rPr>
+                <w:rFonts w:ascii="Times New Roman" w:hAnsi="Times New Roman"/>
+                <w:b w:val="0"/>
+                <w:color w:val="000000"/>
+                <w:sz w:val="20"/>
+              </w:rPr>
+              <w:t>Unemployment rate</w:t>
+            </w:r>
+          </w:p>
+        </w:tc>
+        <w:tc>
+          <w:tcPr>
+            <w:tcW w:type="dxa" w:w="2592"/>
+            <w:vAlign w:val="center"/>
+            <w:shd w:fill="FFFFFF"/>
+            <w:tcMar>
+              <w:top w:w="65" w:type="dxa"/>
+              <w:bottom w:w="65" w:type="dxa"/>
+              <w:start w:w="105" w:type="dxa"/>
+              <w:end w:w="105" w:type="dxa"/>
+            </w:tcMar>
+          </w:tcPr>
+          <w:p>
+            <w:pPr>
+              <w:spacing w:after="0" w:line="252" w:lineRule="auto"/>
+              <w:jc w:val="left"/>
+            </w:pPr>
+            <w:r>
+              <w:rPr>
+                <w:rFonts w:ascii="Times New Roman" w:hAnsi="Times New Roman"/>
+                <w:b w:val="0"/>
+                <w:color w:val="000000"/>
+                <w:sz w:val="20"/>
+              </w:rPr>
+              <w:t>Percent; SA</w:t>
+            </w:r>
+          </w:p>
+        </w:tc>
+      </w:tr>
+      <w:tr>
+        <w:trPr>
+          <w:cantSplit/>
+        </w:trPr>
+        <w:tc>
+          <w:tcPr>
+            <w:tcW w:type="dxa" w:w="2664"/>
+            <w:vAlign w:val="center"/>
+            <w:shd w:fill="F2F6FA"/>
+            <w:tcMar>
+              <w:top w:w="65" w:type="dxa"/>
+              <w:bottom w:w="65" w:type="dxa"/>
+              <w:start w:w="105" w:type="dxa"/>
+              <w:end w:w="105" w:type="dxa"/>
+            </w:tcMar>
+          </w:tcPr>
+          <w:p>
+            <w:pPr>
+              <w:spacing w:after="0" w:line="252" w:lineRule="auto"/>
+              <w:jc w:val="left"/>
+            </w:pPr>
+            <w:r>
+              <w:rPr>
+                <w:rFonts w:ascii="Times New Roman" w:hAnsi="Times New Roman"/>
+                <w:b w:val="0"/>
+                <w:color w:val="000000"/>
+                <w:sz w:val="20"/>
+              </w:rPr>
+              <w:t>FCBC_B.IUSA</w:t>
+            </w:r>
+          </w:p>
+        </w:tc>
+        <w:tc>
+          <w:tcPr>
+            <w:tcW w:type="dxa" w:w="4824"/>
+            <w:vAlign w:val="center"/>
+            <w:shd w:fill="F2F6FA"/>
+            <w:tcMar>
+              <w:top w:w="65" w:type="dxa"/>
+              <w:bottom w:w="65" w:type="dxa"/>
+              <w:start w:w="105" w:type="dxa"/>
+              <w:end w:w="105" w:type="dxa"/>
+            </w:tcMar>
+          </w:tcPr>
+          <w:p>
+            <w:pPr>
+              <w:spacing w:after="0" w:line="252" w:lineRule="auto"/>
+              <w:jc w:val="left"/>
+            </w:pPr>
+            <w:r>
+              <w:rPr>
+                <w:rFonts w:ascii="Times New Roman" w:hAnsi="Times New Roman"/>
+                <w:b w:val="0"/>
+                <w:color w:val="000000"/>
+                <w:sz w:val="20"/>
+              </w:rPr>
+              <w:t>Consumer confidence index</w:t>
+            </w:r>
+          </w:p>
+        </w:tc>
+        <w:tc>
+          <w:tcPr>
+            <w:tcW w:type="dxa" w:w="2592"/>
+            <w:vAlign w:val="center"/>
+            <w:shd w:fill="F2F6FA"/>
+            <w:tcMar>
+              <w:top w:w="65" w:type="dxa"/>
+              <w:bottom w:w="65" w:type="dxa"/>
+              <w:start w:w="105" w:type="dxa"/>
+              <w:end w:w="105" w:type="dxa"/>
+            </w:tcMar>
+          </w:tcPr>
+          <w:p>
+            <w:pPr>
+              <w:spacing w:after="0" w:line="252" w:lineRule="auto"/>
+              <w:jc w:val="left"/>
+            </w:pPr>
+            <w:r>
+              <w:rPr>
+                <w:rFonts w:ascii="Times New Roman" w:hAnsi="Times New Roman"/>
+                <w:b w:val="0"/>
+                <w:color w:val="000000"/>
+                <w:sz w:val="20"/>
+              </w:rPr>
+              <w:t>Index 1985=100; SA</w:t>
+            </w:r>
+          </w:p>
+        </w:tc>
+      </w:tr>
+      <w:tr>
+        <w:trPr>
+          <w:cantSplit/>
+        </w:trPr>
+        <w:tc>
+          <w:tcPr>
+            <w:tcW w:type="dxa" w:w="2664"/>
+            <w:vAlign w:val="center"/>
+            <w:shd w:fill="FFFFFF"/>
+            <w:tcMar>
+              <w:top w:w="65" w:type="dxa"/>
+              <w:bottom w:w="65" w:type="dxa"/>
+              <w:start w:w="105" w:type="dxa"/>
+              <w:end w:w="105" w:type="dxa"/>
+            </w:tcMar>
+          </w:tcPr>
+          <w:p>
+            <w:pPr>
+              <w:spacing w:after="0" w:line="252" w:lineRule="auto"/>
+              <w:jc w:val="left"/>
+            </w:pPr>
+            <w:r>
+              <w:rPr>
+                <w:rFonts w:ascii="Times New Roman" w:hAnsi="Times New Roman"/>
+                <w:b w:val="0"/>
+                <w:color w:val="000000"/>
+                <w:sz w:val="20"/>
+              </w:rPr>
+              <w:t>FSBINQ_B.IUSA</w:t>
+            </w:r>
+          </w:p>
+        </w:tc>
+        <w:tc>
+          <w:tcPr>
+            <w:tcW w:type="dxa" w:w="4824"/>
+            <w:vAlign w:val="center"/>
+            <w:shd w:fill="FFFFFF"/>
+            <w:tcMar>
+              <w:top w:w="65" w:type="dxa"/>
+              <w:bottom w:w="65" w:type="dxa"/>
+              <w:start w:w="105" w:type="dxa"/>
+              <w:end w:w="105" w:type="dxa"/>
+            </w:tcMar>
+          </w:tcPr>
+          <w:p>
+            <w:pPr>
+              <w:spacing w:after="0" w:line="252" w:lineRule="auto"/>
+              <w:jc w:val="left"/>
+            </w:pPr>
+            <w:r>
+              <w:rPr>
+                <w:rFonts w:ascii="Times New Roman" w:hAnsi="Times New Roman"/>
+                <w:b w:val="0"/>
+                <w:color w:val="000000"/>
+                <w:sz w:val="20"/>
+              </w:rPr>
+              <w:t>Small business normalized optimism index</w:t>
+            </w:r>
+          </w:p>
+        </w:tc>
+        <w:tc>
+          <w:tcPr>
+            <w:tcW w:type="dxa" w:w="2592"/>
+            <w:vAlign w:val="center"/>
+            <w:shd w:fill="FFFFFF"/>
+            <w:tcMar>
+              <w:top w:w="65" w:type="dxa"/>
+              <w:bottom w:w="65" w:type="dxa"/>
+              <w:start w:w="105" w:type="dxa"/>
+              <w:end w:w="105" w:type="dxa"/>
+            </w:tcMar>
+          </w:tcPr>
+          <w:p>
+            <w:pPr>
+              <w:spacing w:after="0" w:line="252" w:lineRule="auto"/>
+              <w:jc w:val="left"/>
+            </w:pPr>
+            <w:r>
+              <w:rPr>
+                <w:rFonts w:ascii="Times New Roman" w:hAnsi="Times New Roman"/>
+                <w:b w:val="0"/>
+                <w:color w:val="000000"/>
+                <w:sz w:val="20"/>
+              </w:rPr>
+              <w:t>Index 1986=100; SA</w:t>
+            </w:r>
+          </w:p>
+        </w:tc>
+      </w:tr>
+      <w:tr>
+        <w:trPr>
+          <w:cantSplit/>
+        </w:trPr>
+        <w:tc>
+          <w:tcPr>
+            <w:tcW w:type="dxa" w:w="2664"/>
+            <w:vAlign w:val="center"/>
+            <w:shd w:fill="F2F6FA"/>
+            <w:tcMar>
+              <w:top w:w="65" w:type="dxa"/>
+              <w:bottom w:w="65" w:type="dxa"/>
+              <w:start w:w="105" w:type="dxa"/>
+              <w:end w:w="105" w:type="dxa"/>
+            </w:tcMar>
+          </w:tcPr>
+          <w:p>
+            <w:pPr>
+              <w:spacing w:after="0" w:line="252" w:lineRule="auto"/>
+              <w:jc w:val="left"/>
+            </w:pPr>
+            <w:r>
+              <w:rPr>
+                <w:rFonts w:ascii="Times New Roman" w:hAnsi="Times New Roman"/>
+                <w:b w:val="0"/>
+                <w:color w:val="000000"/>
+                <w:sz w:val="20"/>
+              </w:rPr>
+              <w:t>FGDP$_B.IUSA</w:t>
+            </w:r>
+          </w:p>
+        </w:tc>
+        <w:tc>
+          <w:tcPr>
+            <w:tcW w:type="dxa" w:w="4824"/>
+            <w:vAlign w:val="center"/>
+            <w:shd w:fill="F2F6FA"/>
+            <w:tcMar>
+              <w:top w:w="65" w:type="dxa"/>
+              <w:bottom w:w="65" w:type="dxa"/>
+              <w:start w:w="105" w:type="dxa"/>
+              <w:end w:w="105" w:type="dxa"/>
+            </w:tcMar>
+          </w:tcPr>
+          <w:p>
+            <w:pPr>
+              <w:spacing w:after="0" w:line="252" w:lineRule="auto"/>
+              <w:jc w:val="left"/>
+            </w:pPr>
+            <w:r>
+              <w:rPr>
+                <w:rFonts w:ascii="Times New Roman" w:hAnsi="Times New Roman"/>
+                <w:b w:val="0"/>
+                <w:color w:val="000000"/>
+                <w:sz w:val="20"/>
+              </w:rPr>
+              <w:t>Real gross domestic product</w:t>
+            </w:r>
+          </w:p>
+        </w:tc>
+        <w:tc>
+          <w:tcPr>
+            <w:tcW w:type="dxa" w:w="2592"/>
+            <w:vAlign w:val="center"/>
+            <w:shd w:fill="F2F6FA"/>
+            <w:tcMar>
+              <w:top w:w="65" w:type="dxa"/>
+              <w:bottom w:w="65" w:type="dxa"/>
+              <w:start w:w="105" w:type="dxa"/>
+              <w:end w:w="105" w:type="dxa"/>
+            </w:tcMar>
+          </w:tcPr>
+          <w:p>
+            <w:pPr>
+              <w:spacing w:after="0" w:line="252" w:lineRule="auto"/>
+              <w:jc w:val="left"/>
+            </w:pPr>
+            <w:r>
+              <w:rPr>
+                <w:rFonts w:ascii="Times New Roman" w:hAnsi="Times New Roman"/>
+                <w:b w:val="0"/>
+                <w:color w:val="000000"/>
+                <w:sz w:val="20"/>
+              </w:rPr>
+              <w:t>Billion chained 2017 USD; SAAR</w:t>
+            </w:r>
+          </w:p>
+        </w:tc>
+      </w:tr>
+      <w:tr>
+        <w:trPr>
+          <w:cantSplit/>
+        </w:trPr>
+        <w:tc>
+          <w:tcPr>
+            <w:tcW w:type="dxa" w:w="2664"/>
+            <w:vAlign w:val="center"/>
+            <w:shd w:fill="FFFFFF"/>
+            <w:tcMar>
+              <w:top w:w="65" w:type="dxa"/>
+              <w:bottom w:w="65" w:type="dxa"/>
+              <w:start w:w="105" w:type="dxa"/>
+              <w:end w:w="105" w:type="dxa"/>
+            </w:tcMar>
+          </w:tcPr>
+          <w:p>
+            <w:pPr>
+              <w:spacing w:after="0" w:line="252" w:lineRule="auto"/>
+              <w:jc w:val="left"/>
+            </w:pPr>
+            <w:r>
+              <w:rPr>
+                <w:rFonts w:ascii="Times New Roman" w:hAnsi="Times New Roman"/>
+                <w:b w:val="0"/>
+                <w:color w:val="000000"/>
+                <w:sz w:val="20"/>
+              </w:rPr>
+              <w:t>FGAP_B.IUSA</w:t>
+            </w:r>
+          </w:p>
+        </w:tc>
+        <w:tc>
+          <w:tcPr>
+            <w:tcW w:type="dxa" w:w="4824"/>
+            <w:vAlign w:val="center"/>
+            <w:shd w:fill="FFFFFF"/>
+            <w:tcMar>
+              <w:top w:w="65" w:type="dxa"/>
+              <w:bottom w:w="65" w:type="dxa"/>
+              <w:start w:w="105" w:type="dxa"/>
+              <w:end w:w="105" w:type="dxa"/>
+            </w:tcMar>
+          </w:tcPr>
+          <w:p>
+            <w:pPr>
+              <w:spacing w:after="0" w:line="252" w:lineRule="auto"/>
+              <w:jc w:val="left"/>
+            </w:pPr>
+            <w:r>
+              <w:rPr>
+                <w:rFonts w:ascii="Times New Roman" w:hAnsi="Times New Roman"/>
+                <w:b w:val="0"/>
+                <w:color w:val="000000"/>
+                <w:sz w:val="20"/>
+              </w:rPr>
+              <w:t>Real GDP versus potential GDP output gap</w:t>
+            </w:r>
+          </w:p>
+        </w:tc>
+        <w:tc>
+          <w:tcPr>
+            <w:tcW w:type="dxa" w:w="2592"/>
+            <w:vAlign w:val="center"/>
+            <w:shd w:fill="FFFFFF"/>
+            <w:tcMar>
+              <w:top w:w="65" w:type="dxa"/>
+              <w:bottom w:w="65" w:type="dxa"/>
+              <w:start w:w="105" w:type="dxa"/>
+              <w:end w:w="105" w:type="dxa"/>
+            </w:tcMar>
+          </w:tcPr>
+          <w:p>
+            <w:pPr>
+              <w:spacing w:after="0" w:line="252" w:lineRule="auto"/>
+              <w:jc w:val="left"/>
+            </w:pPr>
+            <w:r>
+              <w:rPr>
+                <w:rFonts w:ascii="Times New Roman" w:hAnsi="Times New Roman"/>
+                <w:b w:val="0"/>
+                <w:color w:val="000000"/>
+                <w:sz w:val="20"/>
+              </w:rPr>
+              <w:t>Percent; SA</w:t>
+            </w:r>
+          </w:p>
+        </w:tc>
+      </w:tr>
+      <w:tr>
+        <w:trPr>
+          <w:cantSplit/>
+        </w:trPr>
+        <w:tc>
+          <w:tcPr>
+            <w:tcW w:type="dxa" w:w="2664"/>
+            <w:vAlign w:val="center"/>
+            <w:shd w:fill="F2F6FA"/>
+            <w:tcMar>
+              <w:top w:w="65" w:type="dxa"/>
+              <w:bottom w:w="65" w:type="dxa"/>
+              <w:start w:w="105" w:type="dxa"/>
+              <w:end w:w="105" w:type="dxa"/>
+            </w:tcMar>
+          </w:tcPr>
+          <w:p>
+            <w:pPr>
+              <w:spacing w:after="0" w:line="252" w:lineRule="auto"/>
+              <w:jc w:val="left"/>
+            </w:pPr>
+            <w:r>
+              <w:rPr>
+                <w:rFonts w:ascii="Times New Roman" w:hAnsi="Times New Roman"/>
+                <w:b w:val="0"/>
+                <w:color w:val="000000"/>
+                <w:sz w:val="20"/>
+              </w:rPr>
+              <w:t>FBBACBQ_B.IUSA</w:t>
+            </w:r>
+          </w:p>
+        </w:tc>
+        <w:tc>
+          <w:tcPr>
+            <w:tcW w:type="dxa" w:w="4824"/>
+            <w:vAlign w:val="center"/>
+            <w:shd w:fill="F2F6FA"/>
+            <w:tcMar>
+              <w:top w:w="65" w:type="dxa"/>
+              <w:bottom w:w="65" w:type="dxa"/>
+              <w:start w:w="105" w:type="dxa"/>
+              <w:end w:w="105" w:type="dxa"/>
+            </w:tcMar>
+          </w:tcPr>
+          <w:p>
+            <w:pPr>
+              <w:spacing w:after="0" w:line="252" w:lineRule="auto"/>
+              <w:jc w:val="left"/>
+            </w:pPr>
+            <w:r>
+              <w:rPr>
+                <w:rFonts w:ascii="Times New Roman" w:hAnsi="Times New Roman"/>
+                <w:b w:val="0"/>
+                <w:color w:val="000000"/>
+                <w:sz w:val="20"/>
+              </w:rPr>
+              <w:t>Commercial banks total assets</w:t>
+            </w:r>
+          </w:p>
+        </w:tc>
+        <w:tc>
+          <w:tcPr>
+            <w:tcW w:type="dxa" w:w="2592"/>
+            <w:vAlign w:val="center"/>
+            <w:shd w:fill="F2F6FA"/>
+            <w:tcMar>
+              <w:top w:w="65" w:type="dxa"/>
+              <w:bottom w:w="65" w:type="dxa"/>
+              <w:start w:w="105" w:type="dxa"/>
+              <w:end w:w="105" w:type="dxa"/>
+            </w:tcMar>
+          </w:tcPr>
+          <w:p>
+            <w:pPr>
+              <w:spacing w:after="0" w:line="252" w:lineRule="auto"/>
+              <w:jc w:val="left"/>
+            </w:pPr>
+            <w:r>
+              <w:rPr>
+                <w:rFonts w:ascii="Times New Roman" w:hAnsi="Times New Roman"/>
+                <w:b w:val="0"/>
+                <w:color w:val="000000"/>
+                <w:sz w:val="20"/>
+              </w:rPr>
+              <w:t>Billion USD; SA</w:t>
+            </w:r>
+          </w:p>
+        </w:tc>
+      </w:tr>
+      <w:tr>
+        <w:trPr>
+          <w:cantSplit/>
+        </w:trPr>
+        <w:tc>
+          <w:tcPr>
+            <w:tcW w:type="dxa" w:w="2664"/>
+            <w:vAlign w:val="center"/>
+            <w:shd w:fill="FFFFFF"/>
+            <w:tcMar>
+              <w:top w:w="65" w:type="dxa"/>
+              <w:bottom w:w="65" w:type="dxa"/>
+              <w:start w:w="105" w:type="dxa"/>
+              <w:end w:w="105" w:type="dxa"/>
+            </w:tcMar>
+          </w:tcPr>
+          <w:p>
+            <w:pPr>
+              <w:spacing w:after="0" w:line="252" w:lineRule="auto"/>
+              <w:jc w:val="left"/>
+            </w:pPr>
+            <w:r>
+              <w:rPr>
+                <w:rFonts w:ascii="Times New Roman" w:hAnsi="Times New Roman"/>
+                <w:b w:val="0"/>
+                <w:color w:val="000000"/>
+                <w:sz w:val="20"/>
+              </w:rPr>
+              <w:t>FBBABLLCBQ_B.IUSA</w:t>
+            </w:r>
+          </w:p>
+        </w:tc>
+        <w:tc>
+          <w:tcPr>
+            <w:tcW w:type="dxa" w:w="4824"/>
+            <w:vAlign w:val="center"/>
+            <w:shd w:fill="FFFFFF"/>
+            <w:tcMar>
+              <w:top w:w="65" w:type="dxa"/>
+              <w:bottom w:w="65" w:type="dxa"/>
+              <w:start w:w="105" w:type="dxa"/>
+              <w:end w:w="105" w:type="dxa"/>
+            </w:tcMar>
+          </w:tcPr>
+          <w:p>
+            <w:pPr>
+              <w:spacing w:after="0" w:line="252" w:lineRule="auto"/>
+              <w:jc w:val="left"/>
+            </w:pPr>
+            <w:r>
+              <w:rPr>
+                <w:rFonts w:ascii="Times New Roman" w:hAnsi="Times New Roman"/>
+                <w:b w:val="0"/>
+                <w:color w:val="000000"/>
+                <w:sz w:val="20"/>
+              </w:rPr>
+              <w:t>Commercial banks loans and leases in bank credit</w:t>
+            </w:r>
+          </w:p>
+        </w:tc>
+        <w:tc>
+          <w:tcPr>
+            <w:tcW w:type="dxa" w:w="2592"/>
+            <w:vAlign w:val="center"/>
+            <w:shd w:fill="FFFFFF"/>
+            <w:tcMar>
+              <w:top w:w="65" w:type="dxa"/>
+              <w:bottom w:w="65" w:type="dxa"/>
+              <w:start w:w="105" w:type="dxa"/>
+              <w:end w:w="105" w:type="dxa"/>
+            </w:tcMar>
+          </w:tcPr>
+          <w:p>
+            <w:pPr>
+              <w:spacing w:after="0" w:line="252" w:lineRule="auto"/>
+              <w:jc w:val="left"/>
+            </w:pPr>
+            <w:r>
+              <w:rPr>
+                <w:rFonts w:ascii="Times New Roman" w:hAnsi="Times New Roman"/>
+                <w:b w:val="0"/>
+                <w:color w:val="000000"/>
+                <w:sz w:val="20"/>
+              </w:rPr>
+              <w:t>Billion USD; SA</w:t>
+            </w:r>
+          </w:p>
+        </w:tc>
+      </w:tr>
+      <w:tr>
+        <w:trPr>
+          <w:cantSplit/>
+        </w:trPr>
+        <w:tc>
+          <w:tcPr>
+            <w:tcW w:type="dxa" w:w="2664"/>
+            <w:vAlign w:val="center"/>
+            <w:shd w:fill="F2F6FA"/>
+            <w:tcMar>
+              <w:top w:w="65" w:type="dxa"/>
+              <w:bottom w:w="65" w:type="dxa"/>
+              <w:start w:w="105" w:type="dxa"/>
+              <w:end w:w="105" w:type="dxa"/>
+            </w:tcMar>
+          </w:tcPr>
+          <w:p>
+            <w:pPr>
+              <w:spacing w:after="0" w:line="252" w:lineRule="auto"/>
+              <w:jc w:val="left"/>
+            </w:pPr>
+            <w:r>
+              <w:rPr>
+                <w:rFonts w:ascii="Times New Roman" w:hAnsi="Times New Roman"/>
+                <w:b w:val="0"/>
+                <w:color w:val="000000"/>
+                <w:sz w:val="20"/>
+              </w:rPr>
+              <w:t>FCBOEVIXQ_B.IUSA</w:t>
+            </w:r>
+          </w:p>
+        </w:tc>
+        <w:tc>
+          <w:tcPr>
+            <w:tcW w:type="dxa" w:w="4824"/>
+            <w:vAlign w:val="center"/>
+            <w:shd w:fill="F2F6FA"/>
+            <w:tcMar>
+              <w:top w:w="65" w:type="dxa"/>
+              <w:bottom w:w="65" w:type="dxa"/>
+              <w:start w:w="105" w:type="dxa"/>
+              <w:end w:w="105" w:type="dxa"/>
+            </w:tcMar>
+          </w:tcPr>
+          <w:p>
+            <w:pPr>
+              <w:spacing w:after="0" w:line="252" w:lineRule="auto"/>
+              <w:jc w:val="left"/>
+            </w:pPr>
+            <w:r>
+              <w:rPr>
+                <w:rFonts w:ascii="Times New Roman" w:hAnsi="Times New Roman"/>
+                <w:b w:val="0"/>
+                <w:color w:val="000000"/>
+                <w:sz w:val="20"/>
+              </w:rPr>
+              <w:t>CBOE S&amp;P 500 volatility index period average</w:t>
+            </w:r>
+          </w:p>
+        </w:tc>
+        <w:tc>
+          <w:tcPr>
+            <w:tcW w:type="dxa" w:w="2592"/>
+            <w:vAlign w:val="center"/>
+            <w:shd w:fill="F2F6FA"/>
+            <w:tcMar>
+              <w:top w:w="65" w:type="dxa"/>
+              <w:bottom w:w="65" w:type="dxa"/>
+              <w:start w:w="105" w:type="dxa"/>
+              <w:end w:w="105" w:type="dxa"/>
+            </w:tcMar>
+          </w:tcPr>
+          <w:p>
+            <w:pPr>
+              <w:spacing w:after="0" w:line="252" w:lineRule="auto"/>
+              <w:jc w:val="left"/>
+            </w:pPr>
+            <w:r>
+              <w:rPr>
+                <w:rFonts w:ascii="Times New Roman" w:hAnsi="Times New Roman"/>
+                <w:b w:val="0"/>
+                <w:color w:val="000000"/>
+                <w:sz w:val="20"/>
+              </w:rPr>
+              <w:t>Index; NSA</w:t>
+            </w:r>
+          </w:p>
+        </w:tc>
+      </w:tr>
+      <w:tr>
+        <w:trPr>
+          <w:cantSplit/>
+        </w:trPr>
+        <w:tc>
+          <w:tcPr>
+            <w:tcW w:type="dxa" w:w="2664"/>
+            <w:vAlign w:val="center"/>
+            <w:shd w:fill="FFFFFF"/>
+            <w:tcMar>
+              <w:top w:w="65" w:type="dxa"/>
+              <w:bottom w:w="65" w:type="dxa"/>
+              <w:start w:w="105" w:type="dxa"/>
+              <w:end w:w="105" w:type="dxa"/>
+            </w:tcMar>
+          </w:tcPr>
+          <w:p>
+            <w:pPr>
+              <w:spacing w:after="0" w:line="252" w:lineRule="auto"/>
+              <w:jc w:val="left"/>
+            </w:pPr>
+            <w:r>
+              <w:rPr>
+                <w:rFonts w:ascii="Times New Roman" w:hAnsi="Times New Roman"/>
+                <w:b w:val="0"/>
+                <w:color w:val="000000"/>
+                <w:sz w:val="20"/>
+              </w:rPr>
+              <w:t>FIRHYBOASQ_B.IUSA</w:t>
+            </w:r>
+          </w:p>
+        </w:tc>
+        <w:tc>
+          <w:tcPr>
+            <w:tcW w:type="dxa" w:w="4824"/>
+            <w:vAlign w:val="center"/>
+            <w:shd w:fill="FFFFFF"/>
+            <w:tcMar>
+              <w:top w:w="65" w:type="dxa"/>
+              <w:bottom w:w="65" w:type="dxa"/>
+              <w:start w:w="105" w:type="dxa"/>
+              <w:end w:w="105" w:type="dxa"/>
+            </w:tcMar>
+          </w:tcPr>
+          <w:p>
+            <w:pPr>
+              <w:spacing w:after="0" w:line="252" w:lineRule="auto"/>
+              <w:jc w:val="left"/>
+            </w:pPr>
+            <w:r>
+              <w:rPr>
+                <w:rFonts w:ascii="Times New Roman" w:hAnsi="Times New Roman"/>
+                <w:b w:val="0"/>
+                <w:color w:val="000000"/>
+                <w:sz w:val="20"/>
+              </w:rPr>
+              <w:t>High yield bond option adjusted spread</w:t>
+            </w:r>
+          </w:p>
+        </w:tc>
+        <w:tc>
+          <w:tcPr>
+            <w:tcW w:type="dxa" w:w="2592"/>
+            <w:vAlign w:val="center"/>
+            <w:shd w:fill="FFFFFF"/>
+            <w:tcMar>
+              <w:top w:w="65" w:type="dxa"/>
+              <w:bottom w:w="65" w:type="dxa"/>
+              <w:start w:w="105" w:type="dxa"/>
+              <w:end w:w="105" w:type="dxa"/>
+            </w:tcMar>
+          </w:tcPr>
+          <w:p>
+            <w:pPr>
+              <w:spacing w:after="0" w:line="252" w:lineRule="auto"/>
+              <w:jc w:val="left"/>
+            </w:pPr>
+            <w:r>
+              <w:rPr>
+                <w:rFonts w:ascii="Times New Roman" w:hAnsi="Times New Roman"/>
+                <w:b w:val="0"/>
+                <w:color w:val="000000"/>
+                <w:sz w:val="20"/>
+              </w:rPr>
+              <w:t>Percentage points; NSA</w:t>
+            </w:r>
+          </w:p>
+        </w:tc>
+      </w:tr>
+      <w:tr>
+        <w:trPr>
+          <w:cantSplit/>
+        </w:trPr>
+        <w:tc>
+          <w:tcPr>
+            <w:tcW w:type="dxa" w:w="2664"/>
+            <w:vAlign w:val="center"/>
+            <w:shd w:fill="F2F6FA"/>
+            <w:tcMar>
+              <w:top w:w="65" w:type="dxa"/>
+              <w:bottom w:w="65" w:type="dxa"/>
+              <w:start w:w="105" w:type="dxa"/>
+              <w:end w:w="105" w:type="dxa"/>
+            </w:tcMar>
+          </w:tcPr>
+          <w:p>
+            <w:pPr>
+              <w:spacing w:after="0" w:line="252" w:lineRule="auto"/>
+              <w:jc w:val="left"/>
+            </w:pPr>
+            <w:r>
+              <w:rPr>
+                <w:rFonts w:ascii="Times New Roman" w:hAnsi="Times New Roman"/>
+                <w:b w:val="0"/>
+                <w:color w:val="000000"/>
+                <w:sz w:val="20"/>
+              </w:rPr>
+              <w:t>FPCNBCPH_B.IUSA</w:t>
+            </w:r>
+          </w:p>
+        </w:tc>
+        <w:tc>
+          <w:tcPr>
+            <w:tcW w:type="dxa" w:w="4824"/>
+            <w:vAlign w:val="center"/>
+            <w:shd w:fill="F2F6FA"/>
+            <w:tcMar>
+              <w:top w:w="65" w:type="dxa"/>
+              <w:bottom w:w="65" w:type="dxa"/>
+              <w:start w:w="105" w:type="dxa"/>
+              <w:end w:w="105" w:type="dxa"/>
+            </w:tcMar>
+          </w:tcPr>
+          <w:p>
+            <w:pPr>
+              <w:spacing w:after="0" w:line="252" w:lineRule="auto"/>
+              <w:jc w:val="left"/>
+            </w:pPr>
+            <w:r>
+              <w:rPr>
+                <w:rFonts w:ascii="Times New Roman" w:hAnsi="Times New Roman"/>
+                <w:b w:val="0"/>
+                <w:color w:val="000000"/>
+                <w:sz w:val="20"/>
+              </w:rPr>
+              <w:t>Nonfarm business hourly compensation</w:t>
+            </w:r>
+          </w:p>
+        </w:tc>
+        <w:tc>
+          <w:tcPr>
+            <w:tcW w:type="dxa" w:w="2592"/>
+            <w:vAlign w:val="center"/>
+            <w:shd w:fill="F2F6FA"/>
+            <w:tcMar>
+              <w:top w:w="65" w:type="dxa"/>
+              <w:bottom w:w="65" w:type="dxa"/>
+              <w:start w:w="105" w:type="dxa"/>
+              <w:end w:w="105" w:type="dxa"/>
+            </w:tcMar>
+          </w:tcPr>
+          <w:p>
+            <w:pPr>
+              <w:spacing w:after="0" w:line="252" w:lineRule="auto"/>
+              <w:jc w:val="left"/>
+            </w:pPr>
+            <w:r>
+              <w:rPr>
+                <w:rFonts w:ascii="Times New Roman" w:hAnsi="Times New Roman"/>
+                <w:b w:val="0"/>
+                <w:color w:val="000000"/>
+                <w:sz w:val="20"/>
+              </w:rPr>
+              <w:t>Index 2017=100; SA</w:t>
+            </w:r>
+          </w:p>
+        </w:tc>
+      </w:tr>
+      <w:tr>
+        <w:trPr>
+          <w:cantSplit/>
+        </w:trPr>
+        <w:tc>
+          <w:tcPr>
+            <w:tcW w:type="dxa" w:w="2664"/>
+            <w:vAlign w:val="center"/>
+            <w:shd w:fill="FFFFFF"/>
+            <w:tcMar>
+              <w:top w:w="65" w:type="dxa"/>
+              <w:bottom w:w="65" w:type="dxa"/>
+              <w:start w:w="105" w:type="dxa"/>
+              <w:end w:w="105" w:type="dxa"/>
+            </w:tcMar>
+          </w:tcPr>
+          <w:p>
+            <w:pPr>
+              <w:spacing w:after="0" w:line="252" w:lineRule="auto"/>
+              <w:jc w:val="left"/>
+            </w:pPr>
+            <w:r>
+              <w:rPr>
+                <w:rFonts w:ascii="Times New Roman" w:hAnsi="Times New Roman"/>
+                <w:b w:val="0"/>
+                <w:color w:val="000000"/>
+                <w:sz w:val="20"/>
+              </w:rPr>
+              <w:t>FLBOPQ_B.IUSA</w:t>
+            </w:r>
+          </w:p>
+        </w:tc>
+        <w:tc>
+          <w:tcPr>
+            <w:tcW w:type="dxa" w:w="4824"/>
+            <w:vAlign w:val="center"/>
+            <w:shd w:fill="FFFFFF"/>
+            <w:tcMar>
+              <w:top w:w="65" w:type="dxa"/>
+              <w:bottom w:w="65" w:type="dxa"/>
+              <w:start w:w="105" w:type="dxa"/>
+              <w:end w:w="105" w:type="dxa"/>
+            </w:tcMar>
+          </w:tcPr>
+          <w:p>
+            <w:pPr>
+              <w:spacing w:after="0" w:line="252" w:lineRule="auto"/>
+              <w:jc w:val="left"/>
+            </w:pPr>
+            <w:r>
+              <w:rPr>
+                <w:rFonts w:ascii="Times New Roman" w:hAnsi="Times New Roman"/>
+                <w:b w:val="0"/>
+                <w:color w:val="000000"/>
+                <w:sz w:val="20"/>
+              </w:rPr>
+              <w:t>Total nonfarm job openings</w:t>
+            </w:r>
+          </w:p>
+        </w:tc>
+        <w:tc>
+          <w:tcPr>
+            <w:tcW w:type="dxa" w:w="2592"/>
+            <w:vAlign w:val="center"/>
+            <w:shd w:fill="FFFFFF"/>
+            <w:tcMar>
+              <w:top w:w="65" w:type="dxa"/>
+              <w:bottom w:w="65" w:type="dxa"/>
+              <w:start w:w="105" w:type="dxa"/>
+              <w:end w:w="105" w:type="dxa"/>
+            </w:tcMar>
+          </w:tcPr>
+          <w:p>
+            <w:pPr>
+              <w:spacing w:after="0" w:line="252" w:lineRule="auto"/>
+              <w:jc w:val="left"/>
+            </w:pPr>
+            <w:r>
+              <w:rPr>
+                <w:rFonts w:ascii="Times New Roman" w:hAnsi="Times New Roman"/>
+                <w:b w:val="0"/>
+                <w:color w:val="000000"/>
+                <w:sz w:val="20"/>
+              </w:rPr>
+              <w:t>Million jobs; SA</w:t>
+            </w:r>
+          </w:p>
+        </w:tc>
+      </w:tr>
+      <w:tr>
+        <w:trPr>
+          <w:cantSplit/>
+        </w:trPr>
+        <w:tc>
+          <w:tcPr>
+            <w:tcW w:type="dxa" w:w="2664"/>
+            <w:vAlign w:val="center"/>
+            <w:shd w:fill="F2F6FA"/>
+            <w:tcMar>
+              <w:top w:w="65" w:type="dxa"/>
+              <w:bottom w:w="65" w:type="dxa"/>
+              <w:start w:w="105" w:type="dxa"/>
+              <w:end w:w="105" w:type="dxa"/>
+            </w:tcMar>
+          </w:tcPr>
+          <w:p>
+            <w:pPr>
+              <w:spacing w:after="0" w:line="252" w:lineRule="auto"/>
+              <w:jc w:val="left"/>
+            </w:pPr>
+            <w:r>
+              <w:rPr>
+                <w:rFonts w:ascii="Times New Roman" w:hAnsi="Times New Roman"/>
+                <w:b w:val="0"/>
+                <w:color w:val="000000"/>
+                <w:sz w:val="20"/>
+              </w:rPr>
+              <w:t>FYPEW52Q_B.IUSA</w:t>
+            </w:r>
+          </w:p>
+        </w:tc>
+        <w:tc>
+          <w:tcPr>
+            <w:tcW w:type="dxa" w:w="4824"/>
+            <w:vAlign w:val="center"/>
+            <w:shd w:fill="F2F6FA"/>
+            <w:tcMar>
+              <w:top w:w="65" w:type="dxa"/>
+              <w:bottom w:w="65" w:type="dxa"/>
+              <w:start w:w="105" w:type="dxa"/>
+              <w:end w:w="105" w:type="dxa"/>
+            </w:tcMar>
+          </w:tcPr>
+          <w:p>
+            <w:pPr>
+              <w:spacing w:after="0" w:line="252" w:lineRule="auto"/>
+              <w:jc w:val="left"/>
+            </w:pPr>
+            <w:r>
+              <w:rPr>
+                <w:rFonts w:ascii="Times New Roman" w:hAnsi="Times New Roman"/>
+                <w:b w:val="0"/>
+                <w:color w:val="000000"/>
+                <w:sz w:val="20"/>
+              </w:rPr>
+              <w:t>Finance and insurance wages and salaries</w:t>
+            </w:r>
+          </w:p>
+        </w:tc>
+        <w:tc>
+          <w:tcPr>
+            <w:tcW w:type="dxa" w:w="2592"/>
+            <w:vAlign w:val="center"/>
+            <w:shd w:fill="F2F6FA"/>
+            <w:tcMar>
+              <w:top w:w="65" w:type="dxa"/>
+              <w:bottom w:w="65" w:type="dxa"/>
+              <w:start w:w="105" w:type="dxa"/>
+              <w:end w:w="105" w:type="dxa"/>
+            </w:tcMar>
+          </w:tcPr>
+          <w:p>
+            <w:pPr>
+              <w:spacing w:after="0" w:line="252" w:lineRule="auto"/>
+              <w:jc w:val="left"/>
+            </w:pPr>
+            <w:r>
+              <w:rPr>
+                <w:rFonts w:ascii="Times New Roman" w:hAnsi="Times New Roman"/>
+                <w:b w:val="0"/>
+                <w:color w:val="000000"/>
+                <w:sz w:val="20"/>
+              </w:rPr>
+              <w:t>Billion USD; SAAR</w:t>
+            </w:r>
+          </w:p>
+        </w:tc>
+      </w:tr>
+      <w:tr>
+        <w:trPr>
+          <w:cantSplit/>
+        </w:trPr>
+        <w:tc>
+          <w:tcPr>
+            <w:tcW w:type="dxa" w:w="2664"/>
+            <w:vAlign w:val="center"/>
+            <w:shd w:fill="FFFFFF"/>
+            <w:tcMar>
+              <w:top w:w="65" w:type="dxa"/>
+              <w:bottom w:w="65" w:type="dxa"/>
+              <w:start w:w="105" w:type="dxa"/>
+              <w:end w:w="105" w:type="dxa"/>
+            </w:tcMar>
+          </w:tcPr>
+          <w:p>
+            <w:pPr>
+              <w:spacing w:after="0" w:line="252" w:lineRule="auto"/>
+              <w:jc w:val="left"/>
+            </w:pPr>
+            <w:r>
+              <w:rPr>
+                <w:rFonts w:ascii="Times New Roman" w:hAnsi="Times New Roman"/>
+                <w:b w:val="0"/>
+                <w:color w:val="000000"/>
+                <w:sz w:val="20"/>
+              </w:rPr>
+              <w:t>FGDP52Q_B.IUSA</w:t>
+            </w:r>
+          </w:p>
+        </w:tc>
+        <w:tc>
+          <w:tcPr>
+            <w:tcW w:type="dxa" w:w="4824"/>
+            <w:vAlign w:val="center"/>
+            <w:shd w:fill="FFFFFF"/>
+            <w:tcMar>
+              <w:top w:w="65" w:type="dxa"/>
+              <w:bottom w:w="65" w:type="dxa"/>
+              <w:start w:w="105" w:type="dxa"/>
+              <w:end w:w="105" w:type="dxa"/>
+            </w:tcMar>
+          </w:tcPr>
+          <w:p>
+            <w:pPr>
+              <w:spacing w:after="0" w:line="252" w:lineRule="auto"/>
+              <w:jc w:val="left"/>
+            </w:pPr>
+            <w:r>
+              <w:rPr>
+                <w:rFonts w:ascii="Times New Roman" w:hAnsi="Times New Roman"/>
+                <w:b w:val="0"/>
+                <w:color w:val="000000"/>
+                <w:sz w:val="20"/>
+              </w:rPr>
+              <w:t>Finance and insurance gross product originating</w:t>
+            </w:r>
+          </w:p>
+        </w:tc>
+        <w:tc>
+          <w:tcPr>
+            <w:tcW w:type="dxa" w:w="2592"/>
+            <w:vAlign w:val="center"/>
+            <w:shd w:fill="FFFFFF"/>
+            <w:tcMar>
+              <w:top w:w="65" w:type="dxa"/>
+              <w:bottom w:w="65" w:type="dxa"/>
+              <w:start w:w="105" w:type="dxa"/>
+              <w:end w:w="105" w:type="dxa"/>
+            </w:tcMar>
+          </w:tcPr>
+          <w:p>
+            <w:pPr>
+              <w:spacing w:after="0" w:line="252" w:lineRule="auto"/>
+              <w:jc w:val="left"/>
+            </w:pPr>
+            <w:r>
+              <w:rPr>
+                <w:rFonts w:ascii="Times New Roman" w:hAnsi="Times New Roman"/>
+                <w:b w:val="0"/>
+                <w:color w:val="000000"/>
+                <w:sz w:val="20"/>
+              </w:rPr>
+              <w:t>Billion USD; SAAR</w:t>
+            </w:r>
+          </w:p>
+        </w:tc>
+      </w:tr>
+      <w:tr>
+        <w:trPr>
+          <w:cantSplit/>
+        </w:trPr>
+        <w:tc>
+          <w:tcPr>
+            <w:tcW w:type="dxa" w:w="2664"/>
+            <w:vAlign w:val="center"/>
+            <w:shd w:fill="F2F6FA"/>
+            <w:tcMar>
+              <w:top w:w="65" w:type="dxa"/>
+              <w:bottom w:w="65" w:type="dxa"/>
+              <w:start w:w="105" w:type="dxa"/>
+              <w:end w:w="105" w:type="dxa"/>
+            </w:tcMar>
+          </w:tcPr>
+          <w:p>
+            <w:pPr>
+              <w:spacing w:after="0" w:line="252" w:lineRule="auto"/>
+              <w:jc w:val="left"/>
+            </w:pPr>
+            <w:r>
+              <w:rPr>
+                <w:rFonts w:ascii="Times New Roman" w:hAnsi="Times New Roman"/>
+                <w:b w:val="0"/>
+                <w:color w:val="000000"/>
+                <w:sz w:val="20"/>
+              </w:rPr>
+              <w:t>FE52_B.IUSA</w:t>
+            </w:r>
+          </w:p>
+        </w:tc>
+        <w:tc>
+          <w:tcPr>
+            <w:tcW w:type="dxa" w:w="4824"/>
+            <w:vAlign w:val="center"/>
+            <w:shd w:fill="F2F6FA"/>
+            <w:tcMar>
+              <w:top w:w="65" w:type="dxa"/>
+              <w:bottom w:w="65" w:type="dxa"/>
+              <w:start w:w="105" w:type="dxa"/>
+              <w:end w:w="105" w:type="dxa"/>
+            </w:tcMar>
+          </w:tcPr>
+          <w:p>
+            <w:pPr>
+              <w:spacing w:after="0" w:line="252" w:lineRule="auto"/>
+              <w:jc w:val="left"/>
+            </w:pPr>
+            <w:r>
+              <w:rPr>
+                <w:rFonts w:ascii="Times New Roman" w:hAnsi="Times New Roman"/>
+                <w:b w:val="0"/>
+                <w:color w:val="000000"/>
+                <w:sz w:val="20"/>
+              </w:rPr>
+              <w:t>Finance and insurance employment</w:t>
+            </w:r>
+          </w:p>
+        </w:tc>
+        <w:tc>
+          <w:tcPr>
+            <w:tcW w:type="dxa" w:w="2592"/>
+            <w:vAlign w:val="center"/>
+            <w:shd w:fill="F2F6FA"/>
+            <w:tcMar>
+              <w:top w:w="65" w:type="dxa"/>
+              <w:bottom w:w="65" w:type="dxa"/>
+              <w:start w:w="105" w:type="dxa"/>
+              <w:end w:w="105" w:type="dxa"/>
+            </w:tcMar>
+          </w:tcPr>
+          <w:p>
+            <w:pPr>
+              <w:spacing w:after="0" w:line="252" w:lineRule="auto"/>
+              <w:jc w:val="left"/>
+            </w:pPr>
+            <w:r>
+              <w:rPr>
+                <w:rFonts w:ascii="Times New Roman" w:hAnsi="Times New Roman"/>
+                <w:b w:val="0"/>
+                <w:color w:val="000000"/>
+                <w:sz w:val="20"/>
+              </w:rPr>
+              <w:t>Million; SA</w:t>
+            </w:r>
+          </w:p>
+        </w:tc>
+      </w:tr>
+      <w:tr>
+        <w:trPr>
+          <w:cantSplit/>
+        </w:trPr>
+        <w:tc>
+          <w:tcPr>
+            <w:tcW w:type="dxa" w:w="2664"/>
+            <w:vAlign w:val="center"/>
+            <w:shd w:fill="FFFFFF"/>
+            <w:tcMar>
+              <w:top w:w="65" w:type="dxa"/>
+              <w:bottom w:w="65" w:type="dxa"/>
+              <w:start w:w="105" w:type="dxa"/>
+              <w:end w:w="105" w:type="dxa"/>
+            </w:tcMar>
+          </w:tcPr>
+          <w:p>
+            <w:pPr>
+              <w:spacing w:after="0" w:line="252" w:lineRule="auto"/>
+              <w:jc w:val="left"/>
+            </w:pPr>
+            <w:r>
+              <w:rPr>
+                <w:rFonts w:ascii="Times New Roman" w:hAnsi="Times New Roman"/>
+                <w:b w:val="0"/>
+                <w:color w:val="000000"/>
+                <w:sz w:val="20"/>
+              </w:rPr>
+              <w:t>FYPCPIQ_B.IUSA</w:t>
+            </w:r>
+          </w:p>
+        </w:tc>
+        <w:tc>
+          <w:tcPr>
+            <w:tcW w:type="dxa" w:w="4824"/>
+            <w:vAlign w:val="center"/>
+            <w:shd w:fill="FFFFFF"/>
+            <w:tcMar>
+              <w:top w:w="65" w:type="dxa"/>
+              <w:bottom w:w="65" w:type="dxa"/>
+              <w:start w:w="105" w:type="dxa"/>
+              <w:end w:w="105" w:type="dxa"/>
+            </w:tcMar>
+          </w:tcPr>
+          <w:p>
+            <w:pPr>
+              <w:spacing w:after="0" w:line="252" w:lineRule="auto"/>
+              <w:jc w:val="left"/>
+            </w:pPr>
+            <w:r>
+              <w:rPr>
+                <w:rFonts w:ascii="Times New Roman" w:hAnsi="Times New Roman"/>
+                <w:b w:val="0"/>
+                <w:color w:val="000000"/>
+                <w:sz w:val="20"/>
+              </w:rPr>
+              <w:t>Per capita income</w:t>
+            </w:r>
+          </w:p>
+        </w:tc>
+        <w:tc>
+          <w:tcPr>
+            <w:tcW w:type="dxa" w:w="2592"/>
+            <w:vAlign w:val="center"/>
+            <w:shd w:fill="FFFFFF"/>
+            <w:tcMar>
+              <w:top w:w="65" w:type="dxa"/>
+              <w:bottom w:w="65" w:type="dxa"/>
+              <w:start w:w="105" w:type="dxa"/>
+              <w:end w:w="105" w:type="dxa"/>
+            </w:tcMar>
+          </w:tcPr>
+          <w:p>
+            <w:pPr>
+              <w:spacing w:after="0" w:line="252" w:lineRule="auto"/>
+              <w:jc w:val="left"/>
+            </w:pPr>
+            <w:r>
+              <w:rPr>
+                <w:rFonts w:ascii="Times New Roman" w:hAnsi="Times New Roman"/>
+                <w:b w:val="0"/>
+                <w:color w:val="000000"/>
+                <w:sz w:val="20"/>
+              </w:rPr>
+              <w:t>USD; SAAR</w:t>
+            </w:r>
+          </w:p>
+        </w:tc>
+      </w:tr>
+      <w:tr>
+        <w:trPr>
+          <w:cantSplit/>
+        </w:trPr>
+        <w:tc>
+          <w:tcPr>
+            <w:tcW w:type="dxa" w:w="2664"/>
+            <w:vAlign w:val="center"/>
+            <w:shd w:fill="F2F6FA"/>
+            <w:tcMar>
+              <w:top w:w="65" w:type="dxa"/>
+              <w:bottom w:w="65" w:type="dxa"/>
+              <w:start w:w="105" w:type="dxa"/>
+              <w:end w:w="105" w:type="dxa"/>
+            </w:tcMar>
+          </w:tcPr>
+          <w:p>
+            <w:pPr>
+              <w:spacing w:after="0" w:line="252" w:lineRule="auto"/>
+              <w:jc w:val="left"/>
+            </w:pPr>
+            <w:r>
+              <w:rPr>
+                <w:rFonts w:ascii="Times New Roman" w:hAnsi="Times New Roman"/>
+                <w:b w:val="0"/>
+                <w:color w:val="000000"/>
+                <w:sz w:val="20"/>
+              </w:rPr>
+              <w:t>FECICCQ_B.IUSA</w:t>
+            </w:r>
+          </w:p>
+        </w:tc>
+        <w:tc>
+          <w:tcPr>
+            <w:tcW w:type="dxa" w:w="4824"/>
+            <w:vAlign w:val="center"/>
+            <w:shd w:fill="F2F6FA"/>
+            <w:tcMar>
+              <w:top w:w="65" w:type="dxa"/>
+              <w:bottom w:w="65" w:type="dxa"/>
+              <w:start w:w="105" w:type="dxa"/>
+              <w:end w:w="105" w:type="dxa"/>
+            </w:tcMar>
+          </w:tcPr>
+          <w:p>
+            <w:pPr>
+              <w:spacing w:after="0" w:line="252" w:lineRule="auto"/>
+              <w:jc w:val="left"/>
+            </w:pPr>
+            <w:r>
+              <w:rPr>
+                <w:rFonts w:ascii="Times New Roman" w:hAnsi="Times New Roman"/>
+                <w:b w:val="0"/>
+                <w:color w:val="000000"/>
+                <w:sz w:val="20"/>
+              </w:rPr>
+              <w:t>All civilian workers total compensation ECI</w:t>
+            </w:r>
+          </w:p>
+        </w:tc>
+        <w:tc>
+          <w:tcPr>
+            <w:tcW w:type="dxa" w:w="2592"/>
+            <w:vAlign w:val="center"/>
+            <w:shd w:fill="F2F6FA"/>
+            <w:tcMar>
+              <w:top w:w="65" w:type="dxa"/>
+              <w:bottom w:w="65" w:type="dxa"/>
+              <w:start w:w="105" w:type="dxa"/>
+              <w:end w:w="105" w:type="dxa"/>
+            </w:tcMar>
+          </w:tcPr>
+          <w:p>
+            <w:pPr>
+              <w:spacing w:after="0" w:line="252" w:lineRule="auto"/>
+              <w:jc w:val="left"/>
+            </w:pPr>
+            <w:r>
+              <w:rPr>
+                <w:rFonts w:ascii="Times New Roman" w:hAnsi="Times New Roman"/>
+                <w:b w:val="0"/>
+                <w:color w:val="000000"/>
+                <w:sz w:val="20"/>
+              </w:rPr>
+              <w:t>Index Dec 2005=100; SA</w:t>
+            </w:r>
+          </w:p>
+        </w:tc>
+      </w:tr>
+    </w:tbl>
+    <w:p>
+      <w:pPr>
+        <w:widowControl/>
+        <w:spacing w:before="140"/>
+      </w:pPr>
+      <w:r>
+        <w:rPr>
+          <w:color w:val="000000"/>
+        </w:rPr>
+        <w:t>SA = seasonally adjusted; NSA = not seasonally adjusted; SAAR = seasonally adjusted annual rate. All series are supplied quarterly levels; no further aggregation is applied. Table 19 gives the transformations actually used in this EF experiment.</w:t>
+      </w:r>
+    </w:p>
+    <w:p>
+      <w:pPr>
+        <w:pStyle w:val="1"/>
+        <w:pageBreakBefore/>
+        <w:widowControl/>
+        <w:spacing w:before="0"/>
+      </w:pPr>
+      <w:r>
+        <w:rPr>
+          <w:color w:val="000000"/>
+        </w:rPr>
+        <w:t>Appendix C Smoothed EF and method references</w:t>
+      </w:r>
+    </w:p>
+    <w:p>
+      <w:pPr>
+        <w:pStyle w:val="af7"/>
+        <w:widowControl/>
+      </w:pPr>
+      <w:r>
+        <w:rPr>
+          <w:color w:val="000000"/>
+        </w:rPr>
+        <w:t>Table 21  Complete EF series used in the analysis</w:t>
       </w:r>
     </w:p>
     <w:tbl>

</xml_diff>